<commit_message>
final version with static changes using tessaract V1
</commit_message>
<xml_diff>
--- a/prompt.docx
+++ b/prompt.docx
@@ -6,16 +6,11 @@
       <w:r>
         <w:t xml:space="preserve">I need a </w:t>
       </w:r>
-      <w:proofErr w:type="gramStart"/>
       <w:r>
         <w:t>five</w:t>
       </w:r>
       <w:r>
-        <w:t xml:space="preserve"> page</w:t>
-      </w:r>
-      <w:proofErr w:type="gramEnd"/>
-      <w:r>
-        <w:t xml:space="preserve"> website. </w:t>
+        <w:t xml:space="preserve"> page website. </w:t>
       </w:r>
       <w:r>
         <w:t xml:space="preserve">Make it beautiful using </w:t>
@@ -42,28 +37,12 @@
         <w:t xml:space="preserve">e and the text portion of that will be fetched from an xml file as per the selected language by the users. Each of the following page </w:t>
       </w:r>
       <w:r>
-        <w:t xml:space="preserve">apart from the first page would also have a </w:t>
-      </w:r>
-      <w:proofErr w:type="spellStart"/>
-      <w:r>
-        <w:t>langauge</w:t>
-      </w:r>
-      <w:proofErr w:type="spellEnd"/>
-      <w:r>
-        <w:t xml:space="preserve"> change drop down for user to change their preferred language.</w:t>
+        <w:t>apart from the first page would also have a langauge change drop down for user to change their preferred language.</w:t>
       </w:r>
     </w:p>
     <w:p>
       <w:r>
-        <w:t>&lt;</w:t>
-      </w:r>
-      <w:proofErr w:type="spellStart"/>
-      <w:r>
-        <w:t>first_page</w:t>
-      </w:r>
-      <w:proofErr w:type="spellEnd"/>
-      <w:r>
-        <w:t>&gt;</w:t>
+        <w:t>&lt;first_page&gt;</w:t>
       </w:r>
     </w:p>
     <w:p>
@@ -92,50 +71,20 @@
         <w:t>selected one</w:t>
       </w:r>
       <w:r>
-        <w:t xml:space="preserve"> as default </w:t>
-      </w:r>
-      <w:r>
-        <w:t>language</w:t>
-      </w:r>
-      <w:r>
-        <w:t xml:space="preserve"> for the next visits. This first page will always check</w:t>
-      </w:r>
-      <w:r>
-        <w:t xml:space="preserve"> if the default </w:t>
-      </w:r>
-      <w:proofErr w:type="spellStart"/>
-      <w:r>
-        <w:t>langage</w:t>
-      </w:r>
-      <w:proofErr w:type="spellEnd"/>
-      <w:r>
-        <w:t xml:space="preserve"> has been set and if yes then it will directly take the user to the page two</w:t>
+        <w:t xml:space="preserve"> as default language for the next visits. This first page will always check</w:t>
+      </w:r>
+      <w:r>
+        <w:t xml:space="preserve"> if the default langage has been set and if yes then it will directly take the user to the page two</w:t>
       </w:r>
     </w:p>
     <w:p>
       <w:r>
-        <w:t>&lt;</w:t>
-      </w:r>
-      <w:proofErr w:type="spellStart"/>
-      <w:r>
-        <w:t>first_page</w:t>
-      </w:r>
-      <w:proofErr w:type="spellEnd"/>
-      <w:r>
-        <w:t>&gt;</w:t>
+        <w:t>&lt;first_page&gt;</w:t>
       </w:r>
     </w:p>
     <w:p>
       <w:r>
-        <w:t>&lt;</w:t>
-      </w:r>
-      <w:proofErr w:type="spellStart"/>
-      <w:r>
-        <w:t>second_page</w:t>
-      </w:r>
-      <w:proofErr w:type="spellEnd"/>
-      <w:r>
-        <w:t>&gt;</w:t>
+        <w:t>&lt;second_page&gt;</w:t>
       </w:r>
     </w:p>
     <w:p>
@@ -171,13 +120,8 @@
       <w:r>
         <w:t xml:space="preserve">The first button would be </w:t>
       </w:r>
-      <w:proofErr w:type="gramStart"/>
-      <w:r>
-        <w:t>take</w:t>
-      </w:r>
-      <w:proofErr w:type="gramEnd"/>
-      <w:r>
-        <w:t xml:space="preserve"> image to check UPI ID.</w:t>
+      <w:r>
+        <w:t>take image to check UPI ID.</w:t>
       </w:r>
       <w:r>
         <w:t xml:space="preserve"> Second would be </w:t>
@@ -192,41 +136,17 @@
         <w:t xml:space="preserve"> These each of the buttons would take the user to their respective pages</w:t>
       </w:r>
       <w:r>
-        <w:t xml:space="preserve">. Page third, fourth and fifth </w:t>
-      </w:r>
-      <w:proofErr w:type="spellStart"/>
-      <w:r>
-        <w:t>respectivly</w:t>
-      </w:r>
-      <w:proofErr w:type="spellEnd"/>
-      <w:r>
-        <w:t>.</w:t>
+        <w:t>. Page third, fourth and fifth respectivly.</w:t>
       </w:r>
     </w:p>
     <w:p>
       <w:r>
-        <w:t>&lt;</w:t>
-      </w:r>
-      <w:proofErr w:type="spellStart"/>
-      <w:r>
-        <w:t>second_page</w:t>
-      </w:r>
-      <w:proofErr w:type="spellEnd"/>
-      <w:r>
-        <w:t>&gt;</w:t>
+        <w:t>&lt;second_page&gt;</w:t>
       </w:r>
     </w:p>
     <w:p>
       <w:r>
-        <w:t>&lt;</w:t>
-      </w:r>
-      <w:proofErr w:type="spellStart"/>
-      <w:r>
-        <w:t>third_page</w:t>
-      </w:r>
-      <w:proofErr w:type="spellEnd"/>
-      <w:r>
-        <w:t>&gt;</w:t>
+        <w:t>&lt;third_page&gt;</w:t>
       </w:r>
     </w:p>
     <w:p>
@@ -234,23 +154,7 @@
         <w:t xml:space="preserve">This will allow a user to capture an image and would </w:t>
       </w:r>
       <w:r>
-        <w:t xml:space="preserve">do the two things. First it will show </w:t>
-      </w:r>
-      <w:proofErr w:type="spellStart"/>
-      <w:r>
-        <w:t>scane</w:t>
-      </w:r>
-      <w:proofErr w:type="spellEnd"/>
-      <w:r>
-        <w:t xml:space="preserve"> the image for QR codes and </w:t>
-      </w:r>
-      <w:proofErr w:type="spellStart"/>
-      <w:r>
-        <w:t>extarc</w:t>
-      </w:r>
-      <w:proofErr w:type="spellEnd"/>
-      <w:r>
-        <w:t xml:space="preserve"> the UPI IDs from each of them using the regex from each of those. Second it will send the image for processing at the VPS sever which will also return </w:t>
+        <w:t xml:space="preserve">do the two things. First it will show scane the image for QR codes and extarc the UPI IDs from each of them using the regex from each of those. Second it will send the image for processing at the VPS sever which will also return </w:t>
       </w:r>
       <w:r>
         <w:t>the UPI IDs present in the page.</w:t>
@@ -268,28 +172,12 @@
     </w:p>
     <w:p>
       <w:r>
-        <w:t>&lt;</w:t>
-      </w:r>
-      <w:proofErr w:type="spellStart"/>
-      <w:r>
-        <w:t>third_page</w:t>
-      </w:r>
-      <w:proofErr w:type="spellEnd"/>
-      <w:r>
-        <w:t>&gt;</w:t>
+        <w:t>&lt;third_page&gt;</w:t>
       </w:r>
     </w:p>
     <w:p>
       <w:r>
-        <w:t>&lt;</w:t>
-      </w:r>
-      <w:proofErr w:type="spellStart"/>
-      <w:r>
-        <w:t>fourth_page</w:t>
-      </w:r>
-      <w:proofErr w:type="spellEnd"/>
-      <w:r>
-        <w:t>&gt;</w:t>
+        <w:t>&lt;fourth_page&gt;</w:t>
       </w:r>
     </w:p>
     <w:p>
@@ -299,28 +187,12 @@
     </w:p>
     <w:p>
       <w:r>
-        <w:t>&lt;</w:t>
-      </w:r>
-      <w:proofErr w:type="spellStart"/>
-      <w:r>
-        <w:t>fourth_page</w:t>
-      </w:r>
-      <w:proofErr w:type="spellEnd"/>
-      <w:r>
-        <w:t>&gt;</w:t>
+        <w:t>&lt;fourth_page&gt;</w:t>
       </w:r>
     </w:p>
     <w:p>
       <w:r>
-        <w:t>&lt;</w:t>
-      </w:r>
-      <w:proofErr w:type="spellStart"/>
-      <w:r>
-        <w:t>fifth_page</w:t>
-      </w:r>
-      <w:proofErr w:type="spellEnd"/>
-      <w:r>
-        <w:t>&gt;</w:t>
+        <w:t>&lt;fifth_page&gt;</w:t>
       </w:r>
     </w:p>
     <w:p>
@@ -334,20 +206,4385 @@
     </w:p>
     <w:p>
       <w:r>
-        <w:t>&lt;</w:t>
-      </w:r>
-      <w:proofErr w:type="spellStart"/>
-      <w:r>
-        <w:t>fifth_page</w:t>
-      </w:r>
-      <w:proofErr w:type="spellEnd"/>
-      <w:r>
-        <w:t>&gt;</w:t>
+        <w:t>&lt;fifth_page&gt;</w:t>
       </w:r>
       <w:r>
         <w:t xml:space="preserve"> </w:t>
       </w:r>
     </w:p>
+    <w:p/>
+    <w:p/>
+    <w:p>
+      <w:r>
+        <w:t>------</w:t>
+      </w:r>
+    </w:p>
+    <w:p>
+      <w:r>
+        <w:t>Prompt for Capture Page</w:t>
+      </w:r>
+    </w:p>
+    <w:p>
+      <w:r>
+        <w:t>------</w:t>
+      </w:r>
+    </w:p>
+    <w:tbl>
+      <w:tblPr>
+        <w:tblStyle w:val="TableGrid"/>
+        <w:tblW w:w="0" w:type="auto"/>
+        <w:tblLook w:val="04A0" w:firstRow="1" w:lastRow="0" w:firstColumn="1" w:lastColumn="0" w:noHBand="0" w:noVBand="1"/>
+      </w:tblPr>
+      <w:tblGrid>
+        <w:gridCol w:w="9016"/>
+      </w:tblGrid>
+      <w:tr>
+        <w:tc>
+          <w:tcPr>
+            <w:tcW w:w="9016" w:type="dxa"/>
+          </w:tcPr>
+          <w:p>
+            <w:pPr>
+              <w:pStyle w:val="NormalWeb"/>
+            </w:pPr>
+            <w:r>
+              <w:t>have a look at the following code block from the capture.html. I want to you make following Change in it.</w:t>
+            </w:r>
+          </w:p>
+          <w:p>
+            <w:pPr>
+              <w:pStyle w:val="NormalWeb"/>
+            </w:pPr>
+          </w:p>
+          <w:p>
+            <w:pPr>
+              <w:pStyle w:val="NormalWeb"/>
+            </w:pPr>
+            <w:r>
+              <w:t xml:space="preserve">1. Remove any unused code. </w:t>
+            </w:r>
+          </w:p>
+          <w:p>
+            <w:pPr>
+              <w:pStyle w:val="NormalWeb"/>
+            </w:pPr>
+            <w:r>
+              <w:t>2. Organise the code more efficiently</w:t>
+            </w:r>
+          </w:p>
+          <w:p>
+            <w:pPr>
+              <w:pStyle w:val="NormalWeb"/>
+            </w:pPr>
+            <w:r>
+              <w:t>3. Correct the visibility of the two buttons in the code block. Those need to be identical dimension wise. The first one would have icon to capture an image and second one to upload the image. The image would be then processed as per the following logic.</w:t>
+            </w:r>
+          </w:p>
+          <w:p>
+            <w:pPr>
+              <w:pStyle w:val="NormalWeb"/>
+            </w:pPr>
+            <w:r>
+              <w:t>3.1 The QR code would be read from the image and UPI ID will be takenout from that using the regex. The text would be like "upi://pay?pa=razorpay.brk@validhdfc&amp;cu=INR". The loic would be the text between "pa=" and "&amp;cu". If the QR code is not there in the image this variable will be left blank. In case multiple QR codes are found then the reply would be please sacne one code at a time.</w:t>
+            </w:r>
+          </w:p>
+          <w:p>
+            <w:pPr>
+              <w:pStyle w:val="NormalWeb"/>
+            </w:pPr>
+            <w:r>
+              <w:t>3.2 Then code would use OCR to read another typed UPI ID. That would be complete UPI ID without the URL. The code will check if multiple IDs are found then the code would reply only one UPI ID can be checked at a time. If no UPI ID was found then it will be left blank.</w:t>
+            </w:r>
+          </w:p>
+          <w:p>
+            <w:pPr>
+              <w:pStyle w:val="NormalWeb"/>
+            </w:pPr>
+            <w:r>
+              <w:t>3.3 In case either of QR Code and OCR UPI ID variable is non empty and other is not present in the image at all then it will show the same UPI to the user with a button below it "Check UPI ID". In case of earlier errors like multiple QR codes or multiple UPI IDs in the image that were will be shown to the user and the user will be told only to try one QR code and UPI ID at a time.</w:t>
+            </w:r>
+          </w:p>
+          <w:p>
+            <w:pPr>
+              <w:pStyle w:val="NormalWeb"/>
+            </w:pPr>
+          </w:p>
+          <w:p>
+            <w:pPr>
+              <w:pStyle w:val="NormalWeb"/>
+            </w:pPr>
+            <w:r>
+              <w:t>3.4 In case the image had only one QR code and UPI ID then the code will try to match the UPI IDs in both of them. The UPI ID from the QR code will be extracted as mentioned in 3.1. If they match then the user will be shown the UPI ID with an option to Check it as mentioned in 3.3. In case the IDs in QR code and UPI ID in text form do not match then an error will be shown mentioning. UPI ID in the QR code and Printed do not match. Please try QR code or UPI ID separately to check. In case of any of these errors. The intital button to capture image or upload it will remain so the user can try again.</w:t>
+            </w:r>
+          </w:p>
+          <w:p>
+            <w:pPr>
+              <w:pStyle w:val="NormalWeb"/>
+            </w:pPr>
+          </w:p>
+          <w:p>
+            <w:pPr>
+              <w:pStyle w:val="NormalWeb"/>
+            </w:pPr>
+            <w:r>
+              <w:t>3.5 When user checks for the UPI ID it Will be checked from a database account_db.xml. Its structure has been given at the last. After a match the name (entity_name) of the entity and registration number (registration_no) will be shown to the user in green text. The earlier UPI ID will also be converted to green colour and the button "Check UPI ID" will not be converted to "Copy UPI to Make Payment". When user will click on this button the verified UPI ID will be copied to the clipboard.</w:t>
+            </w:r>
+          </w:p>
+          <w:p>
+            <w:pPr>
+              <w:pStyle w:val="NormalWeb"/>
+            </w:pPr>
+          </w:p>
+          <w:p>
+            <w:pPr>
+              <w:pStyle w:val="NormalWeb"/>
+            </w:pPr>
+            <w:r>
+              <w:t>Keep the remianing look and feel like that as that is part of an overall theme.</w:t>
+            </w:r>
+          </w:p>
+          <w:p>
+            <w:pPr>
+              <w:pStyle w:val="NormalWeb"/>
+            </w:pPr>
+          </w:p>
+          <w:p>
+            <w:pPr>
+              <w:pStyle w:val="NormalWeb"/>
+            </w:pPr>
+            <w:r>
+              <w:t>-------</w:t>
+            </w:r>
+          </w:p>
+          <w:p>
+            <w:pPr>
+              <w:pStyle w:val="NormalWeb"/>
+            </w:pPr>
+            <w:r>
+              <w:t>Code Block</w:t>
+            </w:r>
+          </w:p>
+          <w:p>
+            <w:pPr>
+              <w:pStyle w:val="NormalWeb"/>
+            </w:pPr>
+            <w:r>
+              <w:t>------</w:t>
+            </w:r>
+          </w:p>
+          <w:p>
+            <w:pPr>
+              <w:pStyle w:val="NormalWeb"/>
+            </w:pPr>
+            <w:r>
+              <w:t>        &lt;div class="content"&gt;</w:t>
+            </w:r>
+          </w:p>
+          <w:p>
+            <w:pPr>
+              <w:pStyle w:val="NormalWeb"/>
+            </w:pPr>
+            <w:r>
+              <w:t>            &lt;div class="capture-container"&gt;</w:t>
+            </w:r>
+          </w:p>
+          <w:p>
+            <w:pPr>
+              <w:pStyle w:val="NormalWeb"/>
+            </w:pPr>
+            <w:r>
+              <w:t>                &lt;video id="videoElement" autoplay playsinline&gt;&lt;/video&gt;</w:t>
+            </w:r>
+          </w:p>
+          <w:p>
+            <w:pPr>
+              <w:pStyle w:val="NormalWeb"/>
+            </w:pPr>
+            <w:r>
+              <w:t>                &lt;img id="imagePreview" alt="Preview"&gt;</w:t>
+            </w:r>
+          </w:p>
+          <w:p>
+            <w:pPr>
+              <w:pStyle w:val="NormalWeb"/>
+            </w:pPr>
+            <w:r>
+              <w:t xml:space="preserve">                </w:t>
+            </w:r>
+          </w:p>
+          <w:p>
+            <w:pPr>
+              <w:pStyle w:val="NormalWeb"/>
+            </w:pPr>
+            <w:r>
+              <w:t>                &lt;div class="button-group"&gt;</w:t>
+            </w:r>
+          </w:p>
+          <w:p>
+            <w:pPr>
+              <w:pStyle w:val="NormalWeb"/>
+            </w:pPr>
+            <w:r>
+              <w:t>                    &lt;button class="action-button" id="startCamera"&gt;</w:t>
+            </w:r>
+          </w:p>
+          <w:p>
+            <w:pPr>
+              <w:pStyle w:val="NormalWeb"/>
+            </w:pPr>
+            <w:r>
+              <w:t xml:space="preserve">                        &lt;i class="fas fa-camera"&gt;&lt;/i&gt; </w:t>
+            </w:r>
+          </w:p>
+          <w:p>
+            <w:pPr>
+              <w:pStyle w:val="NormalWeb"/>
+            </w:pPr>
+            <w:r>
+              <w:t>                        &lt;span&gt;Start Camera&lt;/span&gt;</w:t>
+            </w:r>
+          </w:p>
+          <w:p>
+            <w:pPr>
+              <w:pStyle w:val="NormalWeb"/>
+            </w:pPr>
+            <w:r>
+              <w:t>                    &lt;/button&gt;</w:t>
+            </w:r>
+          </w:p>
+          <w:p>
+            <w:pPr>
+              <w:pStyle w:val="NormalWeb"/>
+            </w:pPr>
+            <w:r>
+              <w:t>                    &lt;label class="action-button" for="fileInput"&gt;</w:t>
+            </w:r>
+          </w:p>
+          <w:p>
+            <w:pPr>
+              <w:pStyle w:val="NormalWeb"/>
+            </w:pPr>
+            <w:r>
+              <w:t xml:space="preserve">                        &lt;i class="fas fa-upload"&gt;&lt;/i&gt; </w:t>
+            </w:r>
+          </w:p>
+          <w:p>
+            <w:pPr>
+              <w:pStyle w:val="NormalWeb"/>
+            </w:pPr>
+            <w:r>
+              <w:t>                        &lt;span&gt;Upload Image&lt;/span&gt;</w:t>
+            </w:r>
+          </w:p>
+          <w:p>
+            <w:pPr>
+              <w:pStyle w:val="NormalWeb"/>
+            </w:pPr>
+            <w:r>
+              <w:t>                    &lt;/label&gt;</w:t>
+            </w:r>
+          </w:p>
+          <w:p>
+            <w:pPr>
+              <w:pStyle w:val="NormalWeb"/>
+            </w:pPr>
+            <w:r>
+              <w:t>                    &lt;input type="file" id="fileInput" accept="image/*"&gt;</w:t>
+            </w:r>
+          </w:p>
+          <w:p>
+            <w:pPr>
+              <w:pStyle w:val="NormalWeb"/>
+            </w:pPr>
+            <w:r>
+              <w:t>                &lt;/div&gt;</w:t>
+            </w:r>
+          </w:p>
+          <w:p>
+            <w:pPr>
+              <w:pStyle w:val="NormalWeb"/>
+            </w:pPr>
+            <w:r>
+              <w:t>            &lt;/div&gt;</w:t>
+            </w:r>
+          </w:p>
+          <w:p>
+            <w:pPr>
+              <w:pStyle w:val="NormalWeb"/>
+            </w:pPr>
+          </w:p>
+          <w:p>
+            <w:pPr>
+              <w:pStyle w:val="NormalWeb"/>
+            </w:pPr>
+            <w:r>
+              <w:t>            &lt;div id="result"&gt;&lt;/div&gt;</w:t>
+            </w:r>
+          </w:p>
+          <w:p>
+            <w:pPr>
+              <w:pStyle w:val="NormalWeb"/>
+            </w:pPr>
+            <w:r>
+              <w:t>        &lt;/div&gt;</w:t>
+            </w:r>
+          </w:p>
+          <w:p>
+            <w:pPr>
+              <w:pStyle w:val="NormalWeb"/>
+            </w:pPr>
+          </w:p>
+          <w:p>
+            <w:pPr>
+              <w:pStyle w:val="NormalWeb"/>
+            </w:pPr>
+            <w:r>
+              <w:t>-------</w:t>
+            </w:r>
+          </w:p>
+          <w:p>
+            <w:pPr>
+              <w:pStyle w:val="NormalWeb"/>
+            </w:pPr>
+            <w:r>
+              <w:t>capture.html</w:t>
+            </w:r>
+          </w:p>
+          <w:p>
+            <w:pPr>
+              <w:pStyle w:val="NormalWeb"/>
+            </w:pPr>
+            <w:r>
+              <w:t>-------</w:t>
+            </w:r>
+          </w:p>
+          <w:p>
+            <w:pPr>
+              <w:pStyle w:val="NormalWeb"/>
+            </w:pPr>
+            <w:r>
+              <w:t>&lt;!DOCTYPE html&gt;</w:t>
+            </w:r>
+          </w:p>
+          <w:p>
+            <w:pPr>
+              <w:pStyle w:val="NormalWeb"/>
+            </w:pPr>
+            <w:r>
+              <w:t>&lt;html lang="en"&gt;</w:t>
+            </w:r>
+          </w:p>
+          <w:p>
+            <w:pPr>
+              <w:pStyle w:val="NormalWeb"/>
+            </w:pPr>
+            <w:r>
+              <w:t>&lt;head&gt;</w:t>
+            </w:r>
+          </w:p>
+          <w:p>
+            <w:pPr>
+              <w:pStyle w:val="NormalWeb"/>
+            </w:pPr>
+            <w:r>
+              <w:t>    &lt;meta charset="UTF-8"&gt;</w:t>
+            </w:r>
+          </w:p>
+          <w:p>
+            <w:pPr>
+              <w:pStyle w:val="NormalWeb"/>
+            </w:pPr>
+            <w:r>
+              <w:t>    &lt;meta name="viewport" content="width=device-width, initial-scale=1.0"&gt;</w:t>
+            </w:r>
+          </w:p>
+          <w:p>
+            <w:pPr>
+              <w:pStyle w:val="NormalWeb"/>
+            </w:pPr>
+            <w:r>
+              <w:t>    &lt;title&gt;SEBI Check - Capture QR Code&lt;/title&gt;</w:t>
+            </w:r>
+          </w:p>
+          <w:p>
+            <w:pPr>
+              <w:pStyle w:val="NormalWeb"/>
+            </w:pPr>
+            <w:r>
+              <w:t>    &lt;link rel="stylesheet" href="https://cdnjs.cloudflare.com/ajax/libs/font-awesome/6.0.0/css/all.min.css"&gt;</w:t>
+            </w:r>
+          </w:p>
+          <w:p>
+            <w:pPr>
+              <w:pStyle w:val="NormalWeb"/>
+            </w:pPr>
+            <w:r>
+              <w:t>    &lt;link rel="stylesheet" href="https://cdnjs.cloudflare.com/ajax/libs/cropperjs/1.5.12/cropper.min.css"&gt;</w:t>
+            </w:r>
+          </w:p>
+          <w:p>
+            <w:pPr>
+              <w:pStyle w:val="NormalWeb"/>
+            </w:pPr>
+            <w:r>
+              <w:t>    &lt;style&gt;</w:t>
+            </w:r>
+          </w:p>
+          <w:p>
+            <w:pPr>
+              <w:pStyle w:val="NormalWeb"/>
+            </w:pPr>
+            <w:r>
+              <w:t>        :root {</w:t>
+            </w:r>
+          </w:p>
+          <w:p>
+            <w:pPr>
+              <w:pStyle w:val="NormalWeb"/>
+            </w:pPr>
+            <w:r>
+              <w:t>            --primary-color: #08317c;</w:t>
+            </w:r>
+          </w:p>
+          <w:p>
+            <w:pPr>
+              <w:pStyle w:val="NormalWeb"/>
+            </w:pPr>
+            <w:r>
+              <w:t>            --white: #ffffff;</w:t>
+            </w:r>
+          </w:p>
+          <w:p>
+            <w:pPr>
+              <w:pStyle w:val="NormalWeb"/>
+            </w:pPr>
+            <w:r>
+              <w:t>            --light-blue: #e6eeff;</w:t>
+            </w:r>
+          </w:p>
+          <w:p>
+            <w:pPr>
+              <w:pStyle w:val="NormalWeb"/>
+            </w:pPr>
+            <w:r>
+              <w:t>            --hover-blue: #0a3d94;</w:t>
+            </w:r>
+          </w:p>
+          <w:p>
+            <w:pPr>
+              <w:pStyle w:val="NormalWeb"/>
+            </w:pPr>
+            <w:r>
+              <w:t>            --text-secondary: #555;</w:t>
+            </w:r>
+          </w:p>
+          <w:p>
+            <w:pPr>
+              <w:pStyle w:val="NormalWeb"/>
+            </w:pPr>
+            <w:r>
+              <w:t>            --danger-color: #dc3545;</w:t>
+            </w:r>
+          </w:p>
+          <w:p>
+            <w:pPr>
+              <w:pStyle w:val="NormalWeb"/>
+            </w:pPr>
+            <w:r>
+              <w:t>        }</w:t>
+            </w:r>
+          </w:p>
+          <w:p>
+            <w:pPr>
+              <w:pStyle w:val="NormalWeb"/>
+            </w:pPr>
+          </w:p>
+          <w:p>
+            <w:pPr>
+              <w:pStyle w:val="NormalWeb"/>
+            </w:pPr>
+            <w:r>
+              <w:t>        body {</w:t>
+            </w:r>
+          </w:p>
+          <w:p>
+            <w:pPr>
+              <w:pStyle w:val="NormalWeb"/>
+            </w:pPr>
+            <w:r>
+              <w:t>            font-family: 'Segoe UI', Tahoma, Geneva, Verdana, sans-serif;</w:t>
+            </w:r>
+          </w:p>
+          <w:p>
+            <w:pPr>
+              <w:pStyle w:val="NormalWeb"/>
+            </w:pPr>
+            <w:r>
+              <w:t>            margin: 0;</w:t>
+            </w:r>
+          </w:p>
+          <w:p>
+            <w:pPr>
+              <w:pStyle w:val="NormalWeb"/>
+            </w:pPr>
+            <w:r>
+              <w:t>            padding: 0;</w:t>
+            </w:r>
+          </w:p>
+          <w:p>
+            <w:pPr>
+              <w:pStyle w:val="NormalWeb"/>
+            </w:pPr>
+            <w:r>
+              <w:t>            background-color: var(--light-blue);</w:t>
+            </w:r>
+          </w:p>
+          <w:p>
+            <w:pPr>
+              <w:pStyle w:val="NormalWeb"/>
+            </w:pPr>
+            <w:r>
+              <w:t>            color: var(--primary-color);</w:t>
+            </w:r>
+          </w:p>
+          <w:p>
+            <w:pPr>
+              <w:pStyle w:val="NormalWeb"/>
+            </w:pPr>
+            <w:r>
+              <w:t>            display: flex;</w:t>
+            </w:r>
+          </w:p>
+          <w:p>
+            <w:pPr>
+              <w:pStyle w:val="NormalWeb"/>
+            </w:pPr>
+            <w:r>
+              <w:t>            flex-direction: column;</w:t>
+            </w:r>
+          </w:p>
+          <w:p>
+            <w:pPr>
+              <w:pStyle w:val="NormalWeb"/>
+            </w:pPr>
+            <w:r>
+              <w:t>            min-height: 100vh;</w:t>
+            </w:r>
+          </w:p>
+          <w:p>
+            <w:pPr>
+              <w:pStyle w:val="NormalWeb"/>
+            </w:pPr>
+            <w:r>
+              <w:t>        }</w:t>
+            </w:r>
+          </w:p>
+          <w:p>
+            <w:pPr>
+              <w:pStyle w:val="NormalWeb"/>
+            </w:pPr>
+          </w:p>
+          <w:p>
+            <w:pPr>
+              <w:pStyle w:val="NormalWeb"/>
+            </w:pPr>
+            <w:r>
+              <w:t>        header {</w:t>
+            </w:r>
+          </w:p>
+          <w:p>
+            <w:pPr>
+              <w:pStyle w:val="NormalWeb"/>
+            </w:pPr>
+            <w:r>
+              <w:t>            background-color: var(--primary-color);</w:t>
+            </w:r>
+          </w:p>
+          <w:p>
+            <w:pPr>
+              <w:pStyle w:val="NormalWeb"/>
+            </w:pPr>
+            <w:r>
+              <w:t>            color: var(--white);</w:t>
+            </w:r>
+          </w:p>
+          <w:p>
+            <w:pPr>
+              <w:pStyle w:val="NormalWeb"/>
+            </w:pPr>
+            <w:r>
+              <w:t>            padding: 1.5rem;</w:t>
+            </w:r>
+          </w:p>
+          <w:p>
+            <w:pPr>
+              <w:pStyle w:val="NormalWeb"/>
+            </w:pPr>
+            <w:r>
+              <w:t>            text-align: center;</w:t>
+            </w:r>
+          </w:p>
+          <w:p>
+            <w:pPr>
+              <w:pStyle w:val="NormalWeb"/>
+            </w:pPr>
+            <w:r>
+              <w:t>            box-shadow: 0 2px 5px rgba(0, 0, 0, 0.1);</w:t>
+            </w:r>
+          </w:p>
+          <w:p>
+            <w:pPr>
+              <w:pStyle w:val="NormalWeb"/>
+            </w:pPr>
+            <w:r>
+              <w:t>            display: flex;</w:t>
+            </w:r>
+          </w:p>
+          <w:p>
+            <w:pPr>
+              <w:pStyle w:val="NormalWeb"/>
+            </w:pPr>
+            <w:r>
+              <w:t>            justify-content: flex-end;</w:t>
+            </w:r>
+          </w:p>
+          <w:p>
+            <w:pPr>
+              <w:pStyle w:val="NormalWeb"/>
+            </w:pPr>
+            <w:r>
+              <w:t>            align-items: center;</w:t>
+            </w:r>
+          </w:p>
+          <w:p>
+            <w:pPr>
+              <w:pStyle w:val="NormalWeb"/>
+            </w:pPr>
+            <w:r>
+              <w:t>            position: relative; /* Add this */</w:t>
+            </w:r>
+          </w:p>
+          <w:p>
+            <w:pPr>
+              <w:pStyle w:val="NormalWeb"/>
+            </w:pPr>
+            <w:r>
+              <w:t>        }</w:t>
+            </w:r>
+          </w:p>
+          <w:p>
+            <w:pPr>
+              <w:pStyle w:val="NormalWeb"/>
+            </w:pPr>
+            <w:r>
+              <w:t xml:space="preserve">        </w:t>
+            </w:r>
+          </w:p>
+          <w:p>
+            <w:pPr>
+              <w:pStyle w:val="NormalWeb"/>
+            </w:pPr>
+            <w:r>
+              <w:t>        header h1 { /* Style specifically for header H1 */</w:t>
+            </w:r>
+          </w:p>
+          <w:p>
+            <w:pPr>
+              <w:pStyle w:val="NormalWeb"/>
+            </w:pPr>
+            <w:r>
+              <w:t>            margin: 0;</w:t>
+            </w:r>
+          </w:p>
+          <w:p>
+            <w:pPr>
+              <w:pStyle w:val="NormalWeb"/>
+            </w:pPr>
+            <w:r>
+              <w:t>            font-size: 2rem;</w:t>
+            </w:r>
+          </w:p>
+          <w:p>
+            <w:pPr>
+              <w:pStyle w:val="NormalWeb"/>
+            </w:pPr>
+            <w:r>
+              <w:t>        }</w:t>
+            </w:r>
+          </w:p>
+          <w:p>
+            <w:pPr>
+              <w:pStyle w:val="NormalWeb"/>
+            </w:pPr>
+            <w:r>
+              <w:t>        .back-button {</w:t>
+            </w:r>
+          </w:p>
+          <w:p>
+            <w:pPr>
+              <w:pStyle w:val="NormalWeb"/>
+            </w:pPr>
+            <w:r>
+              <w:t>            position: absolute;</w:t>
+            </w:r>
+          </w:p>
+          <w:p>
+            <w:pPr>
+              <w:pStyle w:val="NormalWeb"/>
+            </w:pPr>
+            <w:r>
+              <w:t>            left: 1rem;</w:t>
+            </w:r>
+          </w:p>
+          <w:p>
+            <w:pPr>
+              <w:pStyle w:val="NormalWeb"/>
+            </w:pPr>
+            <w:r>
+              <w:t>            top: 50%;</w:t>
+            </w:r>
+          </w:p>
+          <w:p>
+            <w:pPr>
+              <w:pStyle w:val="NormalWeb"/>
+            </w:pPr>
+            <w:r>
+              <w:t>            transform: translateY(-50%);</w:t>
+            </w:r>
+          </w:p>
+          <w:p>
+            <w:pPr>
+              <w:pStyle w:val="NormalWeb"/>
+            </w:pPr>
+            <w:r>
+              <w:t>            background: none;</w:t>
+            </w:r>
+          </w:p>
+          <w:p>
+            <w:pPr>
+              <w:pStyle w:val="NormalWeb"/>
+            </w:pPr>
+            <w:r>
+              <w:t>            border: none;</w:t>
+            </w:r>
+          </w:p>
+          <w:p>
+            <w:pPr>
+              <w:pStyle w:val="NormalWeb"/>
+            </w:pPr>
+            <w:r>
+              <w:t>            color: var(--white);</w:t>
+            </w:r>
+          </w:p>
+          <w:p>
+            <w:pPr>
+              <w:pStyle w:val="NormalWeb"/>
+            </w:pPr>
+            <w:r>
+              <w:t>            cursor: pointer;</w:t>
+            </w:r>
+          </w:p>
+          <w:p>
+            <w:pPr>
+              <w:pStyle w:val="NormalWeb"/>
+            </w:pPr>
+            <w:r>
+              <w:t>            font-size: 1.5rem;</w:t>
+            </w:r>
+          </w:p>
+          <w:p>
+            <w:pPr>
+              <w:pStyle w:val="NormalWeb"/>
+            </w:pPr>
+            <w:r>
+              <w:t>            padding: 0.5rem;</w:t>
+            </w:r>
+          </w:p>
+          <w:p>
+            <w:pPr>
+              <w:pStyle w:val="NormalWeb"/>
+            </w:pPr>
+            <w:r>
+              <w:t>            z-index: 1;</w:t>
+            </w:r>
+          </w:p>
+          <w:p>
+            <w:pPr>
+              <w:pStyle w:val="NormalWeb"/>
+            </w:pPr>
+            <w:r>
+              <w:t>        }</w:t>
+            </w:r>
+          </w:p>
+          <w:p>
+            <w:pPr>
+              <w:pStyle w:val="NormalWeb"/>
+            </w:pPr>
+            <w:r>
+              <w:t>        main {</w:t>
+            </w:r>
+          </w:p>
+          <w:p>
+            <w:pPr>
+              <w:pStyle w:val="NormalWeb"/>
+            </w:pPr>
+            <w:r>
+              <w:t>            flex: 1;</w:t>
+            </w:r>
+          </w:p>
+          <w:p>
+            <w:pPr>
+              <w:pStyle w:val="NormalWeb"/>
+            </w:pPr>
+            <w:r>
+              <w:t>            padding: 2rem;</w:t>
+            </w:r>
+          </w:p>
+          <w:p>
+            <w:pPr>
+              <w:pStyle w:val="NormalWeb"/>
+            </w:pPr>
+            <w:r>
+              <w:t>            max-width: 800px;</w:t>
+            </w:r>
+          </w:p>
+          <w:p>
+            <w:pPr>
+              <w:pStyle w:val="NormalWeb"/>
+            </w:pPr>
+            <w:r>
+              <w:t>            margin: 1rem auto 2rem auto; /* Adjusted margin */</w:t>
+            </w:r>
+          </w:p>
+          <w:p>
+            <w:pPr>
+              <w:pStyle w:val="NormalWeb"/>
+            </w:pPr>
+            <w:r>
+              <w:t>            width: 100%;</w:t>
+            </w:r>
+          </w:p>
+          <w:p>
+            <w:pPr>
+              <w:pStyle w:val="NormalWeb"/>
+            </w:pPr>
+            <w:r>
+              <w:t>            box-sizing: border-box;</w:t>
+            </w:r>
+          </w:p>
+          <w:p>
+            <w:pPr>
+              <w:pStyle w:val="NormalWeb"/>
+            </w:pPr>
+            <w:r>
+              <w:t>        }</w:t>
+            </w:r>
+          </w:p>
+          <w:p>
+            <w:pPr>
+              <w:pStyle w:val="NormalWeb"/>
+            </w:pPr>
+          </w:p>
+          <w:p>
+            <w:pPr>
+              <w:pStyle w:val="NormalWeb"/>
+            </w:pPr>
+            <w:r>
+              <w:t>        .main-logo {</w:t>
+            </w:r>
+          </w:p>
+          <w:p>
+            <w:pPr>
+              <w:pStyle w:val="NormalWeb"/>
+            </w:pPr>
+            <w:r>
+              <w:t>            max-width: 150px;</w:t>
+            </w:r>
+          </w:p>
+          <w:p>
+            <w:pPr>
+              <w:pStyle w:val="NormalWeb"/>
+            </w:pPr>
+            <w:r>
+              <w:t>            width: 100%;</w:t>
+            </w:r>
+          </w:p>
+          <w:p>
+            <w:pPr>
+              <w:pStyle w:val="NormalWeb"/>
+            </w:pPr>
+            <w:r>
+              <w:t>            height: auto;</w:t>
+            </w:r>
+          </w:p>
+          <w:p>
+            <w:pPr>
+              <w:pStyle w:val="NormalWeb"/>
+            </w:pPr>
+            <w:r>
+              <w:t>            display: block;</w:t>
+            </w:r>
+          </w:p>
+          <w:p>
+            <w:pPr>
+              <w:pStyle w:val="NormalWeb"/>
+            </w:pPr>
+            <w:r>
+              <w:t>            margin: 0 auto 1rem auto;</w:t>
+            </w:r>
+          </w:p>
+          <w:p>
+            <w:pPr>
+              <w:pStyle w:val="NormalWeb"/>
+            </w:pPr>
+            <w:r>
+              <w:t>        }</w:t>
+            </w:r>
+          </w:p>
+          <w:p>
+            <w:pPr>
+              <w:pStyle w:val="NormalWeb"/>
+            </w:pPr>
+          </w:p>
+          <w:p>
+            <w:pPr>
+              <w:pStyle w:val="NormalWeb"/>
+            </w:pPr>
+            <w:r>
+              <w:t>        .content {</w:t>
+            </w:r>
+          </w:p>
+          <w:p>
+            <w:pPr>
+              <w:pStyle w:val="NormalWeb"/>
+            </w:pPr>
+            <w:r>
+              <w:t>            background-color: var(--white);</w:t>
+            </w:r>
+          </w:p>
+          <w:p>
+            <w:pPr>
+              <w:pStyle w:val="NormalWeb"/>
+            </w:pPr>
+            <w:r>
+              <w:t>            padding: 2rem;</w:t>
+            </w:r>
+          </w:p>
+          <w:p>
+            <w:pPr>
+              <w:pStyle w:val="NormalWeb"/>
+            </w:pPr>
+            <w:r>
+              <w:t>            border-radius: 12px;</w:t>
+            </w:r>
+          </w:p>
+          <w:p>
+            <w:pPr>
+              <w:pStyle w:val="NormalWeb"/>
+            </w:pPr>
+            <w:r>
+              <w:t>            box-shadow: 0 5px 15px rgba(0, 0, 0, 0.08);</w:t>
+            </w:r>
+          </w:p>
+          <w:p>
+            <w:pPr>
+              <w:pStyle w:val="NormalWeb"/>
+            </w:pPr>
+            <w:r>
+              <w:t>        }</w:t>
+            </w:r>
+          </w:p>
+          <w:p>
+            <w:pPr>
+              <w:pStyle w:val="NormalWeb"/>
+            </w:pPr>
+          </w:p>
+          <w:p>
+            <w:pPr>
+              <w:pStyle w:val="NormalWeb"/>
+            </w:pPr>
+            <w:r>
+              <w:t>        .capture-container {</w:t>
+            </w:r>
+          </w:p>
+          <w:p>
+            <w:pPr>
+              <w:pStyle w:val="NormalWeb"/>
+            </w:pPr>
+            <w:r>
+              <w:t>            text-align: center;</w:t>
+            </w:r>
+          </w:p>
+          <w:p>
+            <w:pPr>
+              <w:pStyle w:val="NormalWeb"/>
+            </w:pPr>
+            <w:r>
+              <w:t>            margin-bottom: 2rem;</w:t>
+            </w:r>
+          </w:p>
+          <w:p>
+            <w:pPr>
+              <w:pStyle w:val="NormalWeb"/>
+            </w:pPr>
+            <w:r>
+              <w:t>        }</w:t>
+            </w:r>
+          </w:p>
+          <w:p>
+            <w:pPr>
+              <w:pStyle w:val="NormalWeb"/>
+            </w:pPr>
+          </w:p>
+          <w:p>
+            <w:pPr>
+              <w:pStyle w:val="NormalWeb"/>
+            </w:pPr>
+            <w:r>
+              <w:t>        #videoElement {</w:t>
+            </w:r>
+          </w:p>
+          <w:p>
+            <w:pPr>
+              <w:pStyle w:val="NormalWeb"/>
+            </w:pPr>
+            <w:r>
+              <w:t>            width: 100%;</w:t>
+            </w:r>
+          </w:p>
+          <w:p>
+            <w:pPr>
+              <w:pStyle w:val="NormalWeb"/>
+            </w:pPr>
+            <w:r>
+              <w:t>            max-width: 640px;</w:t>
+            </w:r>
+          </w:p>
+          <w:p>
+            <w:pPr>
+              <w:pStyle w:val="NormalWeb"/>
+            </w:pPr>
+            <w:r>
+              <w:t>            margin: 0 auto;</w:t>
+            </w:r>
+          </w:p>
+          <w:p>
+            <w:pPr>
+              <w:pStyle w:val="NormalWeb"/>
+            </w:pPr>
+            <w:r>
+              <w:t>            display: none;</w:t>
+            </w:r>
+          </w:p>
+          <w:p>
+            <w:pPr>
+              <w:pStyle w:val="NormalWeb"/>
+            </w:pPr>
+            <w:r>
+              <w:t>        }</w:t>
+            </w:r>
+          </w:p>
+          <w:p>
+            <w:pPr>
+              <w:pStyle w:val="NormalWeb"/>
+            </w:pPr>
+          </w:p>
+          <w:p>
+            <w:pPr>
+              <w:pStyle w:val="NormalWeb"/>
+            </w:pPr>
+            <w:r>
+              <w:t>        #imagePreview {</w:t>
+            </w:r>
+          </w:p>
+          <w:p>
+            <w:pPr>
+              <w:pStyle w:val="NormalWeb"/>
+            </w:pPr>
+            <w:r>
+              <w:t>            max-width: 100%;</w:t>
+            </w:r>
+          </w:p>
+          <w:p>
+            <w:pPr>
+              <w:pStyle w:val="NormalWeb"/>
+            </w:pPr>
+            <w:r>
+              <w:t>            display: none;</w:t>
+            </w:r>
+          </w:p>
+          <w:p>
+            <w:pPr>
+              <w:pStyle w:val="NormalWeb"/>
+            </w:pPr>
+            <w:r>
+              <w:t>        }</w:t>
+            </w:r>
+          </w:p>
+          <w:p>
+            <w:pPr>
+              <w:pStyle w:val="NormalWeb"/>
+            </w:pPr>
+          </w:p>
+          <w:p>
+            <w:pPr>
+              <w:pStyle w:val="NormalWeb"/>
+            </w:pPr>
+            <w:r>
+              <w:t>        .button-group {</w:t>
+            </w:r>
+          </w:p>
+          <w:p>
+            <w:pPr>
+              <w:pStyle w:val="NormalWeb"/>
+            </w:pPr>
+            <w:r>
+              <w:t>            display: flex;</w:t>
+            </w:r>
+          </w:p>
+          <w:p>
+            <w:pPr>
+              <w:pStyle w:val="NormalWeb"/>
+            </w:pPr>
+            <w:r>
+              <w:t>            flex-direction: column; /* Stack buttons vertically */</w:t>
+            </w:r>
+          </w:p>
+          <w:p>
+            <w:pPr>
+              <w:pStyle w:val="NormalWeb"/>
+            </w:pPr>
+            <w:r>
+              <w:t>            gap: 1rem;</w:t>
+            </w:r>
+          </w:p>
+          <w:p>
+            <w:pPr>
+              <w:pStyle w:val="NormalWeb"/>
+            </w:pPr>
+            <w:r>
+              <w:t>            /* justify-content: center; */ /* Removed as stacking vertically */</w:t>
+            </w:r>
+          </w:p>
+          <w:p>
+            <w:pPr>
+              <w:pStyle w:val="NormalWeb"/>
+            </w:pPr>
+            <w:r>
+              <w:t>            margin: 1rem 0;</w:t>
+            </w:r>
+          </w:p>
+          <w:p>
+            <w:pPr>
+              <w:pStyle w:val="NormalWeb"/>
+            </w:pPr>
+            <w:r>
+              <w:t>        }</w:t>
+            </w:r>
+          </w:p>
+          <w:p>
+            <w:pPr>
+              <w:pStyle w:val="NormalWeb"/>
+            </w:pPr>
+          </w:p>
+          <w:p>
+            <w:pPr>
+              <w:pStyle w:val="NormalWeb"/>
+            </w:pPr>
+            <w:r>
+              <w:t>        .action-button {</w:t>
+            </w:r>
+          </w:p>
+          <w:p>
+            <w:pPr>
+              <w:pStyle w:val="NormalWeb"/>
+            </w:pPr>
+            <w:r>
+              <w:t>            background-color: var(--white); /* Match index.html */</w:t>
+            </w:r>
+          </w:p>
+          <w:p>
+            <w:pPr>
+              <w:pStyle w:val="NormalWeb"/>
+            </w:pPr>
+            <w:r>
+              <w:t>            color: var(--primary-color); /* Match index.html */</w:t>
+            </w:r>
+          </w:p>
+          <w:p>
+            <w:pPr>
+              <w:pStyle w:val="NormalWeb"/>
+            </w:pPr>
+            <w:r>
+              <w:t>            border: none; /* Match index.html */</w:t>
+            </w:r>
+          </w:p>
+          <w:p>
+            <w:pPr>
+              <w:pStyle w:val="NormalWeb"/>
+            </w:pPr>
+            <w:r>
+              <w:t>            border-left: 5px solid var(--primary-color); /* Match index.html */</w:t>
+            </w:r>
+          </w:p>
+          <w:p>
+            <w:pPr>
+              <w:pStyle w:val="NormalWeb"/>
+            </w:pPr>
+            <w:r>
+              <w:t>            border-radius: 8px; /* Match index.html */</w:t>
+            </w:r>
+          </w:p>
+          <w:p>
+            <w:pPr>
+              <w:pStyle w:val="NormalWeb"/>
+            </w:pPr>
+            <w:r>
+              <w:t>            padding: 1.5rem 1rem; /* Match index.html */</w:t>
+            </w:r>
+          </w:p>
+          <w:p>
+            <w:pPr>
+              <w:pStyle w:val="NormalWeb"/>
+            </w:pPr>
+            <w:r>
+              <w:t>            cursor: pointer;</w:t>
+            </w:r>
+          </w:p>
+          <w:p>
+            <w:pPr>
+              <w:pStyle w:val="NormalWeb"/>
+            </w:pPr>
+            <w:r>
+              <w:t>            transition: all 0.2s ease-in-out; /* Match index.html */</w:t>
+            </w:r>
+          </w:p>
+          <w:p>
+            <w:pPr>
+              <w:pStyle w:val="NormalWeb"/>
+            </w:pPr>
+            <w:r>
+              <w:t>            display: flex; /* Match index.html */</w:t>
+            </w:r>
+          </w:p>
+          <w:p>
+            <w:pPr>
+              <w:pStyle w:val="NormalWeb"/>
+            </w:pPr>
+            <w:r>
+              <w:t>            flex-direction: column; /* Match index.html */</w:t>
+            </w:r>
+          </w:p>
+          <w:p>
+            <w:pPr>
+              <w:pStyle w:val="NormalWeb"/>
+            </w:pPr>
+            <w:r>
+              <w:t>            align-items: center; /* Match index.html */</w:t>
+            </w:r>
+          </w:p>
+          <w:p>
+            <w:pPr>
+              <w:pStyle w:val="NormalWeb"/>
+            </w:pPr>
+            <w:r>
+              <w:t>            justify-content: center; /* Match index.html */</w:t>
+            </w:r>
+          </w:p>
+          <w:p>
+            <w:pPr>
+              <w:pStyle w:val="NormalWeb"/>
+            </w:pPr>
+            <w:r>
+              <w:t>            text-align: center; /* Match index.html */</w:t>
+            </w:r>
+          </w:p>
+          <w:p>
+            <w:pPr>
+              <w:pStyle w:val="NormalWeb"/>
+            </w:pPr>
+            <w:r>
+              <w:t>            gap: 1rem; /* Match index.html */</w:t>
+            </w:r>
+          </w:p>
+          <w:p>
+            <w:pPr>
+              <w:pStyle w:val="NormalWeb"/>
+            </w:pPr>
+            <w:r>
+              <w:t>            box-shadow: 0 4px 8px rgba(0, 0, 0, 0.04); /* Match index.html */</w:t>
+            </w:r>
+          </w:p>
+          <w:p>
+            <w:pPr>
+              <w:pStyle w:val="NormalWeb"/>
+            </w:pPr>
+            <w:r>
+              <w:t>            width: 100%; /* Ensure full width */</w:t>
+            </w:r>
+          </w:p>
+          <w:p>
+            <w:pPr>
+              <w:pStyle w:val="NormalWeb"/>
+            </w:pPr>
+            <w:r>
+              <w:t>        }</w:t>
+            </w:r>
+          </w:p>
+          <w:p>
+            <w:pPr>
+              <w:pStyle w:val="NormalWeb"/>
+            </w:pPr>
+          </w:p>
+          <w:p>
+            <w:pPr>
+              <w:pStyle w:val="NormalWeb"/>
+            </w:pPr>
+            <w:r>
+              <w:t>        .action-button:hover {</w:t>
+            </w:r>
+          </w:p>
+          <w:p>
+            <w:pPr>
+              <w:pStyle w:val="NormalWeb"/>
+            </w:pPr>
+            <w:r>
+              <w:t>            background-color: var(--primary-color); /* Match index.html */</w:t>
+            </w:r>
+          </w:p>
+          <w:p>
+            <w:pPr>
+              <w:pStyle w:val="NormalWeb"/>
+            </w:pPr>
+            <w:r>
+              <w:t>            color: var(--white); /* Match index.html */</w:t>
+            </w:r>
+          </w:p>
+          <w:p>
+            <w:pPr>
+              <w:pStyle w:val="NormalWeb"/>
+            </w:pPr>
+            <w:r>
+              <w:t>            transform: translateY(-3px); /* Match index.html */</w:t>
+            </w:r>
+          </w:p>
+          <w:p>
+            <w:pPr>
+              <w:pStyle w:val="NormalWeb"/>
+            </w:pPr>
+            <w:r>
+              <w:t>            box-shadow: 0 6px 12px rgba(8, 49, 124, 0.1); /* Match index.html */</w:t>
+            </w:r>
+          </w:p>
+          <w:p>
+            <w:pPr>
+              <w:pStyle w:val="NormalWeb"/>
+            </w:pPr>
+            <w:r>
+              <w:t>        }</w:t>
+            </w:r>
+          </w:p>
+          <w:p>
+            <w:pPr>
+              <w:pStyle w:val="NormalWeb"/>
+            </w:pPr>
+          </w:p>
+          <w:p>
+            <w:pPr>
+              <w:pStyle w:val="NormalWeb"/>
+            </w:pPr>
+            <w:r>
+              <w:t>        /* Add styles for icon and span inside action-button */</w:t>
+            </w:r>
+          </w:p>
+          <w:p>
+            <w:pPr>
+              <w:pStyle w:val="NormalWeb"/>
+            </w:pPr>
+            <w:r>
+              <w:t>        .action-button i {</w:t>
+            </w:r>
+          </w:p>
+          <w:p>
+            <w:pPr>
+              <w:pStyle w:val="NormalWeb"/>
+            </w:pPr>
+            <w:r>
+              <w:t>            font-size: 3.2em;</w:t>
+            </w:r>
+          </w:p>
+          <w:p>
+            <w:pPr>
+              <w:pStyle w:val="NormalWeb"/>
+            </w:pPr>
+            <w:r>
+              <w:t>            margin-bottom: 0.5rem;</w:t>
+            </w:r>
+          </w:p>
+          <w:p>
+            <w:pPr>
+              <w:pStyle w:val="NormalWeb"/>
+            </w:pPr>
+            <w:r>
+              <w:t>            color: inherit;</w:t>
+            </w:r>
+          </w:p>
+          <w:p>
+            <w:pPr>
+              <w:pStyle w:val="NormalWeb"/>
+            </w:pPr>
+            <w:r>
+              <w:t>            transition: color 0.2s ease-in-out;</w:t>
+            </w:r>
+          </w:p>
+          <w:p>
+            <w:pPr>
+              <w:pStyle w:val="NormalWeb"/>
+            </w:pPr>
+            <w:r>
+              <w:t>        }</w:t>
+            </w:r>
+          </w:p>
+          <w:p>
+            <w:pPr>
+              <w:pStyle w:val="NormalWeb"/>
+            </w:pPr>
+          </w:p>
+          <w:p>
+            <w:pPr>
+              <w:pStyle w:val="NormalWeb"/>
+            </w:pPr>
+            <w:r>
+              <w:t>        .action-button span {</w:t>
+            </w:r>
+          </w:p>
+          <w:p>
+            <w:pPr>
+              <w:pStyle w:val="NormalWeb"/>
+            </w:pPr>
+            <w:r>
+              <w:t>            font-size: 1.5em;</w:t>
+            </w:r>
+          </w:p>
+          <w:p>
+            <w:pPr>
+              <w:pStyle w:val="NormalWeb"/>
+            </w:pPr>
+            <w:r>
+              <w:t>            line-height: 1.4;</w:t>
+            </w:r>
+          </w:p>
+          <w:p>
+            <w:pPr>
+              <w:pStyle w:val="NormalWeb"/>
+            </w:pPr>
+            <w:r>
+              <w:t>            color: inherit;</w:t>
+            </w:r>
+          </w:p>
+          <w:p>
+            <w:pPr>
+              <w:pStyle w:val="NormalWeb"/>
+            </w:pPr>
+            <w:r>
+              <w:t>            font-weight: 500;</w:t>
+            </w:r>
+          </w:p>
+          <w:p>
+            <w:pPr>
+              <w:pStyle w:val="NormalWeb"/>
+            </w:pPr>
+            <w:r>
+              <w:t>            flex-grow: 0;</w:t>
+            </w:r>
+          </w:p>
+          <w:p>
+            <w:pPr>
+              <w:pStyle w:val="NormalWeb"/>
+            </w:pPr>
+            <w:r>
+              <w:t>        }</w:t>
+            </w:r>
+          </w:p>
+          <w:p>
+            <w:pPr>
+              <w:pStyle w:val="NormalWeb"/>
+            </w:pPr>
+          </w:p>
+          <w:p>
+            <w:pPr>
+              <w:pStyle w:val="NormalWeb"/>
+            </w:pPr>
+            <w:r>
+              <w:t>        #result {</w:t>
+            </w:r>
+          </w:p>
+          <w:p>
+            <w:pPr>
+              <w:pStyle w:val="NormalWeb"/>
+            </w:pPr>
+            <w:r>
+              <w:t>            margin-top: 2rem;</w:t>
+            </w:r>
+          </w:p>
+          <w:p>
+            <w:pPr>
+              <w:pStyle w:val="NormalWeb"/>
+            </w:pPr>
+            <w:r>
+              <w:t>            padding: 1rem;</w:t>
+            </w:r>
+          </w:p>
+          <w:p>
+            <w:pPr>
+              <w:pStyle w:val="NormalWeb"/>
+            </w:pPr>
+            <w:r>
+              <w:t>            border-radius: 4px;</w:t>
+            </w:r>
+          </w:p>
+          <w:p>
+            <w:pPr>
+              <w:pStyle w:val="NormalWeb"/>
+            </w:pPr>
+            <w:r>
+              <w:t>            text-align: center;</w:t>
+            </w:r>
+          </w:p>
+          <w:p>
+            <w:pPr>
+              <w:pStyle w:val="NormalWeb"/>
+            </w:pPr>
+            <w:r>
+              <w:t>        }</w:t>
+            </w:r>
+          </w:p>
+          <w:p>
+            <w:pPr>
+              <w:pStyle w:val="NormalWeb"/>
+            </w:pPr>
+          </w:p>
+          <w:p>
+            <w:pPr>
+              <w:pStyle w:val="NormalWeb"/>
+            </w:pPr>
+            <w:r>
+              <w:t>        .valid-upi {</w:t>
+            </w:r>
+          </w:p>
+          <w:p>
+            <w:pPr>
+              <w:pStyle w:val="NormalWeb"/>
+            </w:pPr>
+            <w:r>
+              <w:t>            color: var(--primary-color);</w:t>
+            </w:r>
+          </w:p>
+          <w:p>
+            <w:pPr>
+              <w:pStyle w:val="NormalWeb"/>
+            </w:pPr>
+            <w:r>
+              <w:t>            font-weight: bold;</w:t>
+            </w:r>
+          </w:p>
+          <w:p>
+            <w:pPr>
+              <w:pStyle w:val="NormalWeb"/>
+            </w:pPr>
+            <w:r>
+              <w:t>        }</w:t>
+            </w:r>
+          </w:p>
+          <w:p>
+            <w:pPr>
+              <w:pStyle w:val="NormalWeb"/>
+            </w:pPr>
+          </w:p>
+          <w:p>
+            <w:pPr>
+              <w:pStyle w:val="NormalWeb"/>
+            </w:pPr>
+            <w:r>
+              <w:t>        .invalid-upi {</w:t>
+            </w:r>
+          </w:p>
+          <w:p>
+            <w:pPr>
+              <w:pStyle w:val="NormalWeb"/>
+            </w:pPr>
+            <w:r>
+              <w:t>            color: var(--danger-color);</w:t>
+            </w:r>
+          </w:p>
+          <w:p>
+            <w:pPr>
+              <w:pStyle w:val="NormalWeb"/>
+            </w:pPr>
+            <w:r>
+              <w:t>            font-weight: bold;</w:t>
+            </w:r>
+          </w:p>
+          <w:p>
+            <w:pPr>
+              <w:pStyle w:val="NormalWeb"/>
+            </w:pPr>
+            <w:r>
+              <w:t>        }</w:t>
+            </w:r>
+          </w:p>
+          <w:p>
+            <w:pPr>
+              <w:pStyle w:val="NormalWeb"/>
+            </w:pPr>
+          </w:p>
+          <w:p>
+            <w:pPr>
+              <w:pStyle w:val="NormalWeb"/>
+            </w:pPr>
+            <w:r>
+              <w:t>        .copy-button {</w:t>
+            </w:r>
+          </w:p>
+          <w:p>
+            <w:pPr>
+              <w:pStyle w:val="NormalWeb"/>
+            </w:pPr>
+            <w:r>
+              <w:t>            background-color: var(--primary-color);</w:t>
+            </w:r>
+          </w:p>
+          <w:p>
+            <w:pPr>
+              <w:pStyle w:val="NormalWeb"/>
+            </w:pPr>
+            <w:r>
+              <w:t>            color: var(--white);</w:t>
+            </w:r>
+          </w:p>
+          <w:p>
+            <w:pPr>
+              <w:pStyle w:val="NormalWeb"/>
+            </w:pPr>
+            <w:r>
+              <w:t>            border: none;</w:t>
+            </w:r>
+          </w:p>
+          <w:p>
+            <w:pPr>
+              <w:pStyle w:val="NormalWeb"/>
+            </w:pPr>
+            <w:r>
+              <w:t>            border-radius: 4px;</w:t>
+            </w:r>
+          </w:p>
+          <w:p>
+            <w:pPr>
+              <w:pStyle w:val="NormalWeb"/>
+            </w:pPr>
+            <w:r>
+              <w:t>            padding: 0.5rem 1rem;</w:t>
+            </w:r>
+          </w:p>
+          <w:p>
+            <w:pPr>
+              <w:pStyle w:val="NormalWeb"/>
+            </w:pPr>
+            <w:r>
+              <w:t>            cursor: pointer;</w:t>
+            </w:r>
+          </w:p>
+          <w:p>
+            <w:pPr>
+              <w:pStyle w:val="NormalWeb"/>
+            </w:pPr>
+            <w:r>
+              <w:t>            margin-top: 1rem;</w:t>
+            </w:r>
+          </w:p>
+          <w:p>
+            <w:pPr>
+              <w:pStyle w:val="NormalWeb"/>
+            </w:pPr>
+            <w:r>
+              <w:t>        }</w:t>
+            </w:r>
+          </w:p>
+          <w:p>
+            <w:pPr>
+              <w:pStyle w:val="NormalWeb"/>
+            </w:pPr>
+          </w:p>
+          <w:p>
+            <w:pPr>
+              <w:pStyle w:val="NormalWeb"/>
+            </w:pPr>
+          </w:p>
+          <w:p>
+            <w:pPr>
+              <w:pStyle w:val="NormalWeb"/>
+            </w:pPr>
+          </w:p>
+          <w:p>
+            <w:pPr>
+              <w:pStyle w:val="NormalWeb"/>
+            </w:pPr>
+            <w:r>
+              <w:t>        .language-display {</w:t>
+            </w:r>
+          </w:p>
+          <w:p>
+            <w:pPr>
+              <w:pStyle w:val="NormalWeb"/>
+            </w:pPr>
+            <w:r>
+              <w:t>            font-size: 0.9rem;</w:t>
+            </w:r>
+          </w:p>
+          <w:p>
+            <w:pPr>
+              <w:pStyle w:val="NormalWeb"/>
+            </w:pPr>
+            <w:r>
+              <w:t>            background-color: var(--white);</w:t>
+            </w:r>
+          </w:p>
+          <w:p>
+            <w:pPr>
+              <w:pStyle w:val="NormalWeb"/>
+            </w:pPr>
+            <w:r>
+              <w:t>            color: var(--primary-color);</w:t>
+            </w:r>
+          </w:p>
+          <w:p>
+            <w:pPr>
+              <w:pStyle w:val="NormalWeb"/>
+            </w:pPr>
+            <w:r>
+              <w:t>            padding: 0.5rem 1rem;</w:t>
+            </w:r>
+          </w:p>
+          <w:p>
+            <w:pPr>
+              <w:pStyle w:val="NormalWeb"/>
+            </w:pPr>
+            <w:r>
+              <w:t>            border-radius: 4px;</w:t>
+            </w:r>
+          </w:p>
+          <w:p>
+            <w:pPr>
+              <w:pStyle w:val="NormalWeb"/>
+            </w:pPr>
+            <w:r>
+              <w:t>            cursor: pointer;</w:t>
+            </w:r>
+          </w:p>
+          <w:p>
+            <w:pPr>
+              <w:pStyle w:val="NormalWeb"/>
+            </w:pPr>
+            <w:r>
+              <w:t>            transition: background-color 0.3s ease;</w:t>
+            </w:r>
+          </w:p>
+          <w:p>
+            <w:pPr>
+              <w:pStyle w:val="NormalWeb"/>
+            </w:pPr>
+            <w:r>
+              <w:t>        }</w:t>
+            </w:r>
+          </w:p>
+          <w:p>
+            <w:pPr>
+              <w:pStyle w:val="NormalWeb"/>
+            </w:pPr>
+          </w:p>
+          <w:p>
+            <w:pPr>
+              <w:pStyle w:val="NormalWeb"/>
+            </w:pPr>
+            <w:r>
+              <w:t>        .language-display:hover {</w:t>
+            </w:r>
+          </w:p>
+          <w:p>
+            <w:pPr>
+              <w:pStyle w:val="NormalWeb"/>
+            </w:pPr>
+            <w:r>
+              <w:t>            background-color: var(--light-blue);</w:t>
+            </w:r>
+          </w:p>
+          <w:p>
+            <w:pPr>
+              <w:pStyle w:val="NormalWeb"/>
+            </w:pPr>
+            <w:r>
+              <w:t>        }</w:t>
+            </w:r>
+          </w:p>
+          <w:p>
+            <w:pPr>
+              <w:pStyle w:val="NormalWeb"/>
+            </w:pPr>
+            <w:r>
+              <w:t>        @media (max-width: 600px) {</w:t>
+            </w:r>
+          </w:p>
+          <w:p>
+            <w:pPr>
+              <w:pStyle w:val="NormalWeb"/>
+            </w:pPr>
+            <w:r>
+              <w:t>            header {</w:t>
+            </w:r>
+          </w:p>
+          <w:p>
+            <w:pPr>
+              <w:pStyle w:val="NormalWeb"/>
+            </w:pPr>
+            <w:r>
+              <w:t>                flex-direction: column;</w:t>
+            </w:r>
+          </w:p>
+          <w:p>
+            <w:pPr>
+              <w:pStyle w:val="NormalWeb"/>
+            </w:pPr>
+            <w:r>
+              <w:t>                gap: 1rem;</w:t>
+            </w:r>
+          </w:p>
+          <w:p>
+            <w:pPr>
+              <w:pStyle w:val="NormalWeb"/>
+            </w:pPr>
+            <w:r>
+              <w:t>                padding: 1rem;</w:t>
+            </w:r>
+          </w:p>
+          <w:p>
+            <w:pPr>
+              <w:pStyle w:val="NormalWeb"/>
+            </w:pPr>
+            <w:r>
+              <w:t>                justify-content: center; /* Center alignment for mobile */</w:t>
+            </w:r>
+          </w:p>
+          <w:p>
+            <w:pPr>
+              <w:pStyle w:val="NormalWeb"/>
+            </w:pPr>
+            <w:r>
+              <w:t>            }</w:t>
+            </w:r>
+          </w:p>
+          <w:p>
+            <w:pPr>
+              <w:pStyle w:val="NormalWeb"/>
+            </w:pPr>
+            <w:r>
+              <w:t>            header h1 {</w:t>
+            </w:r>
+          </w:p>
+          <w:p>
+            <w:pPr>
+              <w:pStyle w:val="NormalWeb"/>
+            </w:pPr>
+            <w:r>
+              <w:t>                font-size: 1.5rem;</w:t>
+            </w:r>
+          </w:p>
+          <w:p>
+            <w:pPr>
+              <w:pStyle w:val="NormalWeb"/>
+            </w:pPr>
+            <w:r>
+              <w:t>            }</w:t>
+            </w:r>
+          </w:p>
+          <w:p>
+            <w:pPr>
+              <w:pStyle w:val="NormalWeb"/>
+            </w:pPr>
+            <w:r>
+              <w:t>            main {</w:t>
+            </w:r>
+          </w:p>
+          <w:p>
+            <w:pPr>
+              <w:pStyle w:val="NormalWeb"/>
+            </w:pPr>
+            <w:r>
+              <w:t>                padding: 1rem;</w:t>
+            </w:r>
+          </w:p>
+          <w:p>
+            <w:pPr>
+              <w:pStyle w:val="NormalWeb"/>
+            </w:pPr>
+            <w:r>
+              <w:t>                margin: 1rem auto;</w:t>
+            </w:r>
+          </w:p>
+          <w:p>
+            <w:pPr>
+              <w:pStyle w:val="NormalWeb"/>
+            </w:pPr>
+            <w:r>
+              <w:t>            }</w:t>
+            </w:r>
+          </w:p>
+          <w:p>
+            <w:pPr>
+              <w:pStyle w:val="NormalWeb"/>
+            </w:pPr>
+            <w:r>
+              <w:t>             main h1 { /* Adjust main title on mobile */</w:t>
+            </w:r>
+          </w:p>
+          <w:p>
+            <w:pPr>
+              <w:pStyle w:val="NormalWeb"/>
+            </w:pPr>
+            <w:r>
+              <w:t>                 font-size: 1.5rem;</w:t>
+            </w:r>
+          </w:p>
+          <w:p>
+            <w:pPr>
+              <w:pStyle w:val="NormalWeb"/>
+            </w:pPr>
+            <w:r>
+              <w:t>            }</w:t>
+            </w:r>
+          </w:p>
+          <w:p>
+            <w:pPr>
+              <w:pStyle w:val="NormalWeb"/>
+            </w:pPr>
+            <w:r>
+              <w:t>             .main-logo {</w:t>
+            </w:r>
+          </w:p>
+          <w:p>
+            <w:pPr>
+              <w:pStyle w:val="NormalWeb"/>
+            </w:pPr>
+            <w:r>
+              <w:t>                 max-width: 120px; /* Slightly smaller logo on mobile */</w:t>
+            </w:r>
+          </w:p>
+          <w:p>
+            <w:pPr>
+              <w:pStyle w:val="NormalWeb"/>
+            </w:pPr>
+            <w:r>
+              <w:t>            }</w:t>
+            </w:r>
+          </w:p>
+          <w:p>
+            <w:pPr>
+              <w:pStyle w:val="NormalWeb"/>
+            </w:pPr>
+            <w:r>
+              <w:t>            .content {</w:t>
+            </w:r>
+          </w:p>
+          <w:p>
+            <w:pPr>
+              <w:pStyle w:val="NormalWeb"/>
+            </w:pPr>
+            <w:r>
+              <w:t>                padding: 1.5rem;</w:t>
+            </w:r>
+          </w:p>
+          <w:p>
+            <w:pPr>
+              <w:pStyle w:val="NormalWeb"/>
+            </w:pPr>
+            <w:r>
+              <w:t>            }</w:t>
+            </w:r>
+          </w:p>
+          <w:p>
+            <w:pPr>
+              <w:pStyle w:val="NormalWeb"/>
+            </w:pPr>
+            <w:r>
+              <w:t>             .section-title {</w:t>
+            </w:r>
+          </w:p>
+          <w:p>
+            <w:pPr>
+              <w:pStyle w:val="NormalWeb"/>
+            </w:pPr>
+            <w:r>
+              <w:t>                 font-size: 1.1em;</w:t>
+            </w:r>
+          </w:p>
+          <w:p>
+            <w:pPr>
+              <w:pStyle w:val="NormalWeb"/>
+            </w:pPr>
+            <w:r>
+              <w:t>             }</w:t>
+            </w:r>
+          </w:p>
+          <w:p>
+            <w:pPr>
+              <w:pStyle w:val="NormalWeb"/>
+            </w:pPr>
+            <w:r>
+              <w:t>            .option-button {</w:t>
+            </w:r>
+          </w:p>
+          <w:p>
+            <w:pPr>
+              <w:pStyle w:val="NormalWeb"/>
+            </w:pPr>
+            <w:r>
+              <w:t>                padding: 1.2rem 0.8rem;</w:t>
+            </w:r>
+          </w:p>
+          <w:p>
+            <w:pPr>
+              <w:pStyle w:val="NormalWeb"/>
+            </w:pPr>
+            <w:r>
+              <w:t>                gap: 0.8rem;</w:t>
+            </w:r>
+          </w:p>
+          <w:p>
+            <w:pPr>
+              <w:pStyle w:val="NormalWeb"/>
+            </w:pPr>
+            <w:r>
+              <w:t>            }</w:t>
+            </w:r>
+          </w:p>
+          <w:p>
+            <w:pPr>
+              <w:pStyle w:val="NormalWeb"/>
+            </w:pPr>
+            <w:r>
+              <w:t>            .option-button i {</w:t>
+            </w:r>
+          </w:p>
+          <w:p>
+            <w:pPr>
+              <w:pStyle w:val="NormalWeb"/>
+            </w:pPr>
+            <w:r>
+              <w:t>                font-size: 2.8em; /* Slightly smaller icon on mobile */</w:t>
+            </w:r>
+          </w:p>
+          <w:p>
+            <w:pPr>
+              <w:pStyle w:val="NormalWeb"/>
+            </w:pPr>
+            <w:r>
+              <w:t>            }</w:t>
+            </w:r>
+          </w:p>
+          <w:p>
+            <w:pPr>
+              <w:pStyle w:val="NormalWeb"/>
+            </w:pPr>
+            <w:r>
+              <w:t>            .option-button span {</w:t>
+            </w:r>
+          </w:p>
+          <w:p>
+            <w:pPr>
+              <w:pStyle w:val="NormalWeb"/>
+            </w:pPr>
+            <w:r>
+              <w:t>                font-size: 1em; /* Slightly smaller text on mobile */</w:t>
+            </w:r>
+          </w:p>
+          <w:p>
+            <w:pPr>
+              <w:pStyle w:val="NormalWeb"/>
+            </w:pPr>
+            <w:r>
+              <w:t>            }</w:t>
+            </w:r>
+          </w:p>
+          <w:p>
+            <w:pPr>
+              <w:pStyle w:val="NormalWeb"/>
+            </w:pPr>
+            <w:r>
+              <w:t>            /* Adjust action-button styles for mobile */</w:t>
+            </w:r>
+          </w:p>
+          <w:p>
+            <w:pPr>
+              <w:pStyle w:val="NormalWeb"/>
+            </w:pPr>
+            <w:r>
+              <w:t>            .action-button {</w:t>
+            </w:r>
+          </w:p>
+          <w:p>
+            <w:pPr>
+              <w:pStyle w:val="NormalWeb"/>
+            </w:pPr>
+            <w:r>
+              <w:t>                padding: 1.2rem 0.8rem;</w:t>
+            </w:r>
+          </w:p>
+          <w:p>
+            <w:pPr>
+              <w:pStyle w:val="NormalWeb"/>
+            </w:pPr>
+            <w:r>
+              <w:t>                gap: 0.8rem;</w:t>
+            </w:r>
+          </w:p>
+          <w:p>
+            <w:pPr>
+              <w:pStyle w:val="NormalWeb"/>
+            </w:pPr>
+            <w:r>
+              <w:t>            }</w:t>
+            </w:r>
+          </w:p>
+          <w:p>
+            <w:pPr>
+              <w:pStyle w:val="NormalWeb"/>
+            </w:pPr>
+            <w:r>
+              <w:t>            .action-button i {</w:t>
+            </w:r>
+          </w:p>
+          <w:p>
+            <w:pPr>
+              <w:pStyle w:val="NormalWeb"/>
+            </w:pPr>
+            <w:r>
+              <w:t>                font-size: 2.8em; /* Slightly smaller icon on mobile */</w:t>
+            </w:r>
+          </w:p>
+          <w:p>
+            <w:pPr>
+              <w:pStyle w:val="NormalWeb"/>
+            </w:pPr>
+            <w:r>
+              <w:t>            }</w:t>
+            </w:r>
+          </w:p>
+          <w:p>
+            <w:pPr>
+              <w:pStyle w:val="NormalWeb"/>
+            </w:pPr>
+            <w:r>
+              <w:t>            .action-button span {</w:t>
+            </w:r>
+          </w:p>
+          <w:p>
+            <w:pPr>
+              <w:pStyle w:val="NormalWeb"/>
+            </w:pPr>
+            <w:r>
+              <w:t>                font-size: 1em; /* Slightly smaller text on mobile */</w:t>
+            </w:r>
+          </w:p>
+          <w:p>
+            <w:pPr>
+              <w:pStyle w:val="NormalWeb"/>
+            </w:pPr>
+            <w:r>
+              <w:t>            }</w:t>
+            </w:r>
+          </w:p>
+          <w:p>
+            <w:pPr>
+              <w:pStyle w:val="NormalWeb"/>
+            </w:pPr>
+            <w:r>
+              <w:t>        }</w:t>
+            </w:r>
+          </w:p>
+          <w:p>
+            <w:pPr>
+              <w:pStyle w:val="NormalWeb"/>
+            </w:pPr>
+          </w:p>
+          <w:p>
+            <w:pPr>
+              <w:pStyle w:val="NormalWeb"/>
+            </w:pPr>
+            <w:r>
+              <w:t>    &lt;/style&gt;</w:t>
+            </w:r>
+          </w:p>
+          <w:p>
+            <w:pPr>
+              <w:pStyle w:val="NormalWeb"/>
+            </w:pPr>
+            <w:r>
+              <w:t>&lt;/head&gt;</w:t>
+            </w:r>
+          </w:p>
+          <w:p>
+            <w:pPr>
+              <w:pStyle w:val="NormalWeb"/>
+            </w:pPr>
+            <w:r>
+              <w:t>&lt;body&gt;</w:t>
+            </w:r>
+          </w:p>
+          <w:p>
+            <w:pPr>
+              <w:pStyle w:val="NormalWeb"/>
+            </w:pPr>
+            <w:r>
+              <w:t>    &lt;header&gt;</w:t>
+            </w:r>
+          </w:p>
+          <w:p>
+            <w:pPr>
+              <w:pStyle w:val="NormalWeb"/>
+            </w:pPr>
+            <w:r>
+              <w:t>        &lt;div id="language-display" class="language-display" onclick="changeLanguage()"&gt;</w:t>
+            </w:r>
+          </w:p>
+          <w:p>
+            <w:pPr>
+              <w:pStyle w:val="NormalWeb"/>
+            </w:pPr>
+            <w:r>
+              <w:t>            Language: &lt;span id="current-language"&gt;Loading...&lt;/span&gt;</w:t>
+            </w:r>
+          </w:p>
+          <w:p>
+            <w:pPr>
+              <w:pStyle w:val="NormalWeb"/>
+            </w:pPr>
+            <w:r>
+              <w:t>        &lt;/div&gt;</w:t>
+            </w:r>
+          </w:p>
+          <w:p>
+            <w:pPr>
+              <w:pStyle w:val="NormalWeb"/>
+            </w:pPr>
+            <w:r>
+              <w:t>        &lt;button class="back-button" onclick="window.location.href='index.html'"&gt;</w:t>
+            </w:r>
+          </w:p>
+          <w:p>
+            <w:pPr>
+              <w:pStyle w:val="NormalWeb"/>
+            </w:pPr>
+            <w:r>
+              <w:t>            &lt;i class="fas fa-arrow-left"&gt;&lt;/i&gt;</w:t>
+            </w:r>
+          </w:p>
+          <w:p>
+            <w:pPr>
+              <w:pStyle w:val="NormalWeb"/>
+            </w:pPr>
+            <w:r>
+              <w:t>        &lt;/button&gt;</w:t>
+            </w:r>
+          </w:p>
+          <w:p>
+            <w:pPr>
+              <w:pStyle w:val="NormalWeb"/>
+            </w:pPr>
+            <w:r>
+              <w:t>    &lt;/header&gt;</w:t>
+            </w:r>
+          </w:p>
+          <w:p>
+            <w:pPr>
+              <w:pStyle w:val="NormalWeb"/>
+            </w:pPr>
+          </w:p>
+          <w:p>
+            <w:pPr>
+              <w:pStyle w:val="NormalWeb"/>
+            </w:pPr>
+            <w:r>
+              <w:t>    &lt;main&gt;</w:t>
+            </w:r>
+          </w:p>
+          <w:p>
+            <w:pPr>
+              <w:pStyle w:val="NormalWeb"/>
+            </w:pPr>
+            <w:r>
+              <w:t>        &lt;img src="https://dur682txgv28e.cloudfront.net/assets/images/sebi-logo-crop.png" alt="SEBI Logo" class="main-logo"&gt;</w:t>
+            </w:r>
+          </w:p>
+          <w:p>
+            <w:pPr>
+              <w:pStyle w:val="NormalWeb"/>
+            </w:pPr>
+            <w:r>
+              <w:t>        &lt;h1 align="center"&gt;CHECK&lt;/h1&gt;</w:t>
+            </w:r>
+          </w:p>
+          <w:p>
+            <w:pPr>
+              <w:pStyle w:val="NormalWeb"/>
+            </w:pPr>
+            <w:r>
+              <w:t xml:space="preserve">        </w:t>
+            </w:r>
+          </w:p>
+          <w:p>
+            <w:pPr>
+              <w:pStyle w:val="NormalWeb"/>
+            </w:pPr>
+            <w:r>
+              <w:t>        &lt;div class="content"&gt;</w:t>
+            </w:r>
+          </w:p>
+          <w:p>
+            <w:pPr>
+              <w:pStyle w:val="NormalWeb"/>
+            </w:pPr>
+            <w:r>
+              <w:t>            &lt;div class="capture-container"&gt;</w:t>
+            </w:r>
+          </w:p>
+          <w:p>
+            <w:pPr>
+              <w:pStyle w:val="NormalWeb"/>
+            </w:pPr>
+            <w:r>
+              <w:t>                &lt;video id="videoElement" autoplay playsinline&gt;&lt;/video&gt;</w:t>
+            </w:r>
+          </w:p>
+          <w:p>
+            <w:pPr>
+              <w:pStyle w:val="NormalWeb"/>
+            </w:pPr>
+            <w:r>
+              <w:t>                &lt;img id="imagePreview" alt="Preview"&gt;</w:t>
+            </w:r>
+          </w:p>
+          <w:p>
+            <w:pPr>
+              <w:pStyle w:val="NormalWeb"/>
+            </w:pPr>
+            <w:r>
+              <w:t xml:space="preserve">                </w:t>
+            </w:r>
+          </w:p>
+          <w:p>
+            <w:pPr>
+              <w:pStyle w:val="NormalWeb"/>
+            </w:pPr>
+            <w:r>
+              <w:t>                &lt;div class="button-group"&gt;</w:t>
+            </w:r>
+          </w:p>
+          <w:p>
+            <w:pPr>
+              <w:pStyle w:val="NormalWeb"/>
+            </w:pPr>
+            <w:r>
+              <w:t>                    &lt;button class="action-button" id="startCamera"&gt;</w:t>
+            </w:r>
+          </w:p>
+          <w:p>
+            <w:pPr>
+              <w:pStyle w:val="NormalWeb"/>
+            </w:pPr>
+            <w:r>
+              <w:t xml:space="preserve">                        &lt;i class="fas fa-camera"&gt;&lt;/i&gt; </w:t>
+            </w:r>
+          </w:p>
+          <w:p>
+            <w:pPr>
+              <w:pStyle w:val="NormalWeb"/>
+            </w:pPr>
+            <w:r>
+              <w:t>                        &lt;span&gt;Start Camera&lt;/span&gt;</w:t>
+            </w:r>
+          </w:p>
+          <w:p>
+            <w:pPr>
+              <w:pStyle w:val="NormalWeb"/>
+            </w:pPr>
+            <w:r>
+              <w:t>                    &lt;/button&gt;</w:t>
+            </w:r>
+          </w:p>
+          <w:p>
+            <w:pPr>
+              <w:pStyle w:val="NormalWeb"/>
+            </w:pPr>
+            <w:r>
+              <w:t>                    &lt;label class="action-button" for="fileInput"&gt;</w:t>
+            </w:r>
+          </w:p>
+          <w:p>
+            <w:pPr>
+              <w:pStyle w:val="NormalWeb"/>
+            </w:pPr>
+            <w:r>
+              <w:t xml:space="preserve">                        &lt;i class="fas fa-upload"&gt;&lt;/i&gt; </w:t>
+            </w:r>
+          </w:p>
+          <w:p>
+            <w:pPr>
+              <w:pStyle w:val="NormalWeb"/>
+            </w:pPr>
+            <w:r>
+              <w:t>                        &lt;span&gt;Upload Image&lt;/span&gt;</w:t>
+            </w:r>
+          </w:p>
+          <w:p>
+            <w:pPr>
+              <w:pStyle w:val="NormalWeb"/>
+            </w:pPr>
+            <w:r>
+              <w:t>                    &lt;/label&gt;</w:t>
+            </w:r>
+          </w:p>
+          <w:p>
+            <w:pPr>
+              <w:pStyle w:val="NormalWeb"/>
+            </w:pPr>
+            <w:r>
+              <w:t>                    &lt;input type="file" id="fileInput" accept="image/*"&gt;</w:t>
+            </w:r>
+          </w:p>
+          <w:p>
+            <w:pPr>
+              <w:pStyle w:val="NormalWeb"/>
+            </w:pPr>
+            <w:r>
+              <w:t>                &lt;/div&gt;</w:t>
+            </w:r>
+          </w:p>
+          <w:p>
+            <w:pPr>
+              <w:pStyle w:val="NormalWeb"/>
+            </w:pPr>
+            <w:r>
+              <w:t>            &lt;/div&gt;</w:t>
+            </w:r>
+          </w:p>
+          <w:p>
+            <w:pPr>
+              <w:pStyle w:val="NormalWeb"/>
+            </w:pPr>
+          </w:p>
+          <w:p>
+            <w:pPr>
+              <w:pStyle w:val="NormalWeb"/>
+            </w:pPr>
+            <w:r>
+              <w:t>            &lt;div id="result"&gt;&lt;/div&gt;</w:t>
+            </w:r>
+          </w:p>
+          <w:p>
+            <w:pPr>
+              <w:pStyle w:val="NormalWeb"/>
+            </w:pPr>
+            <w:r>
+              <w:t>        &lt;/div&gt;</w:t>
+            </w:r>
+          </w:p>
+          <w:p>
+            <w:pPr>
+              <w:pStyle w:val="NormalWeb"/>
+            </w:pPr>
+            <w:r>
+              <w:t>    &lt;/main&gt;</w:t>
+            </w:r>
+          </w:p>
+          <w:p>
+            <w:pPr>
+              <w:pStyle w:val="NormalWeb"/>
+            </w:pPr>
+          </w:p>
+          <w:p>
+            <w:pPr>
+              <w:pStyle w:val="NormalWeb"/>
+            </w:pPr>
+            <w:r>
+              <w:t>    &lt;script src="https://cdnjs.cloudflare.com/ajax/libs/cropperjs/1.5.12/cropper.min.js"&gt;&lt;/script&gt;</w:t>
+            </w:r>
+          </w:p>
+          <w:p>
+            <w:pPr>
+              <w:pStyle w:val="NormalWeb"/>
+            </w:pPr>
+            <w:r>
+              <w:t>    &lt;script src="https://cdn.jsdelivr.net/npm/jsqr@1.4.0/dist/jsQR.min.js"&gt;&lt;/script&gt;</w:t>
+            </w:r>
+          </w:p>
+          <w:p>
+            <w:pPr>
+              <w:pStyle w:val="NormalWeb"/>
+            </w:pPr>
+            <w:r>
+              <w:t>    &lt;script&gt;</w:t>
+            </w:r>
+          </w:p>
+          <w:p>
+            <w:pPr>
+              <w:pStyle w:val="NormalWeb"/>
+            </w:pPr>
+            <w:r>
+              <w:t>        let stream = null;</w:t>
+            </w:r>
+          </w:p>
+          <w:p>
+            <w:pPr>
+              <w:pStyle w:val="NormalWeb"/>
+            </w:pPr>
+            <w:r>
+              <w:t>        let cropper = null;</w:t>
+            </w:r>
+          </w:p>
+          <w:p>
+            <w:pPr>
+              <w:pStyle w:val="NormalWeb"/>
+            </w:pPr>
+            <w:r>
+              <w:t>        const video = document.getElementById('videoElement');</w:t>
+            </w:r>
+          </w:p>
+          <w:p>
+            <w:pPr>
+              <w:pStyle w:val="NormalWeb"/>
+            </w:pPr>
+            <w:r>
+              <w:t>        const imagePreview = document.getElementById('imagePreview');</w:t>
+            </w:r>
+          </w:p>
+          <w:p>
+            <w:pPr>
+              <w:pStyle w:val="NormalWeb"/>
+            </w:pPr>
+            <w:r>
+              <w:t>        const startButton = document.getElementById('startCamera');</w:t>
+            </w:r>
+          </w:p>
+          <w:p>
+            <w:pPr>
+              <w:pStyle w:val="NormalWeb"/>
+            </w:pPr>
+            <w:r>
+              <w:t>        const captureButton = document.getElementById('captureImage');</w:t>
+            </w:r>
+          </w:p>
+          <w:p>
+            <w:pPr>
+              <w:pStyle w:val="NormalWeb"/>
+            </w:pPr>
+            <w:r>
+              <w:t>        const fileInput = document.getElementById('fileInput');</w:t>
+            </w:r>
+          </w:p>
+          <w:p>
+            <w:pPr>
+              <w:pStyle w:val="NormalWeb"/>
+            </w:pPr>
+            <w:r>
+              <w:t>        const resultDiv = document.getElementById('result');</w:t>
+            </w:r>
+          </w:p>
+          <w:p>
+            <w:pPr>
+              <w:pStyle w:val="NormalWeb"/>
+            </w:pPr>
+          </w:p>
+          <w:p>
+            <w:pPr>
+              <w:pStyle w:val="NormalWeb"/>
+            </w:pPr>
+            <w:r>
+              <w:t>        startButton.addEventListener('click', startCamera);</w:t>
+            </w:r>
+          </w:p>
+          <w:p>
+            <w:pPr>
+              <w:pStyle w:val="NormalWeb"/>
+            </w:pPr>
+            <w:r>
+              <w:t>        captureButton.addEventListener('click', captureImage);</w:t>
+            </w:r>
+          </w:p>
+          <w:p>
+            <w:pPr>
+              <w:pStyle w:val="NormalWeb"/>
+            </w:pPr>
+            <w:r>
+              <w:t>        fileInput.addEventListener('change', handleFileUpload);</w:t>
+            </w:r>
+          </w:p>
+          <w:p>
+            <w:pPr>
+              <w:pStyle w:val="NormalWeb"/>
+            </w:pPr>
+          </w:p>
+          <w:p>
+            <w:pPr>
+              <w:pStyle w:val="NormalWeb"/>
+            </w:pPr>
+            <w:r>
+              <w:t>        async function startCamera() {</w:t>
+            </w:r>
+          </w:p>
+          <w:p>
+            <w:pPr>
+              <w:pStyle w:val="NormalWeb"/>
+            </w:pPr>
+            <w:r>
+              <w:t>            try {</w:t>
+            </w:r>
+          </w:p>
+          <w:p>
+            <w:pPr>
+              <w:pStyle w:val="NormalWeb"/>
+            </w:pPr>
+            <w:r>
+              <w:t>                stream = await navigator.mediaDevices.getUserMedia({ video: { facingMode: 'environment' } });</w:t>
+            </w:r>
+          </w:p>
+          <w:p>
+            <w:pPr>
+              <w:pStyle w:val="NormalWeb"/>
+            </w:pPr>
+            <w:r>
+              <w:t>                video.srcObject = stream;</w:t>
+            </w:r>
+          </w:p>
+          <w:p>
+            <w:pPr>
+              <w:pStyle w:val="NormalWeb"/>
+            </w:pPr>
+            <w:r>
+              <w:t>                video.style.display = 'block';</w:t>
+            </w:r>
+          </w:p>
+          <w:p>
+            <w:pPr>
+              <w:pStyle w:val="NormalWeb"/>
+            </w:pPr>
+            <w:r>
+              <w:t>                imagePreview.style.display = 'none';</w:t>
+            </w:r>
+          </w:p>
+          <w:p>
+            <w:pPr>
+              <w:pStyle w:val="NormalWeb"/>
+            </w:pPr>
+            <w:r>
+              <w:t>                startButton.style.display = 'none';</w:t>
+            </w:r>
+          </w:p>
+          <w:p>
+            <w:pPr>
+              <w:pStyle w:val="NormalWeb"/>
+            </w:pPr>
+            <w:r>
+              <w:t>                captureButton.style.display = 'inline-block';</w:t>
+            </w:r>
+          </w:p>
+          <w:p>
+            <w:pPr>
+              <w:pStyle w:val="NormalWeb"/>
+            </w:pPr>
+            <w:r>
+              <w:t>            } catch (err) {</w:t>
+            </w:r>
+          </w:p>
+          <w:p>
+            <w:pPr>
+              <w:pStyle w:val="NormalWeb"/>
+            </w:pPr>
+            <w:r>
+              <w:t>                console.error('Error accessing camera:', err);</w:t>
+            </w:r>
+          </w:p>
+          <w:p>
+            <w:pPr>
+              <w:pStyle w:val="NormalWeb"/>
+            </w:pPr>
+            <w:r>
+              <w:t>                alert('Could not access camera. Please ensure camera permissions are granted.');</w:t>
+            </w:r>
+          </w:p>
+          <w:p>
+            <w:pPr>
+              <w:pStyle w:val="NormalWeb"/>
+            </w:pPr>
+            <w:r>
+              <w:t>            }</w:t>
+            </w:r>
+          </w:p>
+          <w:p>
+            <w:pPr>
+              <w:pStyle w:val="NormalWeb"/>
+            </w:pPr>
+            <w:r>
+              <w:t>        }</w:t>
+            </w:r>
+          </w:p>
+          <w:p>
+            <w:pPr>
+              <w:pStyle w:val="NormalWeb"/>
+            </w:pPr>
+          </w:p>
+          <w:p>
+            <w:pPr>
+              <w:pStyle w:val="NormalWeb"/>
+            </w:pPr>
+            <w:r>
+              <w:t>        function captureImage() {</w:t>
+            </w:r>
+          </w:p>
+          <w:p>
+            <w:pPr>
+              <w:pStyle w:val="NormalWeb"/>
+            </w:pPr>
+            <w:r>
+              <w:t>            const canvas = document.createElement('canvas');</w:t>
+            </w:r>
+          </w:p>
+          <w:p>
+            <w:pPr>
+              <w:pStyle w:val="NormalWeb"/>
+            </w:pPr>
+            <w:r>
+              <w:t>            canvas.width = video.videoWidth;</w:t>
+            </w:r>
+          </w:p>
+          <w:p>
+            <w:pPr>
+              <w:pStyle w:val="NormalWeb"/>
+            </w:pPr>
+            <w:r>
+              <w:t>            canvas.height = video.videoHeight;</w:t>
+            </w:r>
+          </w:p>
+          <w:p>
+            <w:pPr>
+              <w:pStyle w:val="NormalWeb"/>
+            </w:pPr>
+            <w:r>
+              <w:t>            canvas.getContext('2d').drawImage(video, 0, 0);</w:t>
+            </w:r>
+          </w:p>
+          <w:p>
+            <w:pPr>
+              <w:pStyle w:val="NormalWeb"/>
+            </w:pPr>
+            <w:r>
+              <w:t xml:space="preserve">            </w:t>
+            </w:r>
+          </w:p>
+          <w:p>
+            <w:pPr>
+              <w:pStyle w:val="NormalWeb"/>
+            </w:pPr>
+            <w:r>
+              <w:t>            processImage(canvas.toDataURL('image/jpeg'));</w:t>
+            </w:r>
+          </w:p>
+          <w:p>
+            <w:pPr>
+              <w:pStyle w:val="NormalWeb"/>
+            </w:pPr>
+            <w:r>
+              <w:t xml:space="preserve">            </w:t>
+            </w:r>
+          </w:p>
+          <w:p>
+            <w:pPr>
+              <w:pStyle w:val="NormalWeb"/>
+            </w:pPr>
+            <w:r>
+              <w:t>            if (stream) {</w:t>
+            </w:r>
+          </w:p>
+          <w:p>
+            <w:pPr>
+              <w:pStyle w:val="NormalWeb"/>
+            </w:pPr>
+            <w:r>
+              <w:t>                stream.getTracks().forEach(track =&gt; track.stop());</w:t>
+            </w:r>
+          </w:p>
+          <w:p>
+            <w:pPr>
+              <w:pStyle w:val="NormalWeb"/>
+            </w:pPr>
+            <w:r>
+              <w:t>            }</w:t>
+            </w:r>
+          </w:p>
+          <w:p>
+            <w:pPr>
+              <w:pStyle w:val="NormalWeb"/>
+            </w:pPr>
+            <w:r>
+              <w:t>            video.style.display = 'none';</w:t>
+            </w:r>
+          </w:p>
+          <w:p>
+            <w:pPr>
+              <w:pStyle w:val="NormalWeb"/>
+            </w:pPr>
+            <w:r>
+              <w:t>            captureButton.style.display = 'none';</w:t>
+            </w:r>
+          </w:p>
+          <w:p>
+            <w:pPr>
+              <w:pStyle w:val="NormalWeb"/>
+            </w:pPr>
+            <w:r>
+              <w:t>            startButton.style.display = 'inline-block';</w:t>
+            </w:r>
+          </w:p>
+          <w:p>
+            <w:pPr>
+              <w:pStyle w:val="NormalWeb"/>
+            </w:pPr>
+            <w:r>
+              <w:t>        }</w:t>
+            </w:r>
+          </w:p>
+          <w:p>
+            <w:pPr>
+              <w:pStyle w:val="NormalWeb"/>
+            </w:pPr>
+          </w:p>
+          <w:p>
+            <w:pPr>
+              <w:pStyle w:val="NormalWeb"/>
+            </w:pPr>
+            <w:r>
+              <w:t>        function handleFileUpload(e) {</w:t>
+            </w:r>
+          </w:p>
+          <w:p>
+            <w:pPr>
+              <w:pStyle w:val="NormalWeb"/>
+            </w:pPr>
+            <w:r>
+              <w:t>            const file = e.target.files[0];</w:t>
+            </w:r>
+          </w:p>
+          <w:p>
+            <w:pPr>
+              <w:pStyle w:val="NormalWeb"/>
+            </w:pPr>
+            <w:r>
+              <w:t>            if (file) {</w:t>
+            </w:r>
+          </w:p>
+          <w:p>
+            <w:pPr>
+              <w:pStyle w:val="NormalWeb"/>
+            </w:pPr>
+            <w:r>
+              <w:t>                const reader = new FileReader();</w:t>
+            </w:r>
+          </w:p>
+          <w:p>
+            <w:pPr>
+              <w:pStyle w:val="NormalWeb"/>
+            </w:pPr>
+            <w:r>
+              <w:t>                reader.onload = function(event) {</w:t>
+            </w:r>
+          </w:p>
+          <w:p>
+            <w:pPr>
+              <w:pStyle w:val="NormalWeb"/>
+            </w:pPr>
+            <w:r>
+              <w:t>                    processImage(event.target.result);</w:t>
+            </w:r>
+          </w:p>
+          <w:p>
+            <w:pPr>
+              <w:pStyle w:val="NormalWeb"/>
+            </w:pPr>
+            <w:r>
+              <w:t>                };</w:t>
+            </w:r>
+          </w:p>
+          <w:p>
+            <w:pPr>
+              <w:pStyle w:val="NormalWeb"/>
+            </w:pPr>
+            <w:r>
+              <w:t>                reader.readAsDataURL(file);</w:t>
+            </w:r>
+          </w:p>
+          <w:p>
+            <w:pPr>
+              <w:pStyle w:val="NormalWeb"/>
+            </w:pPr>
+            <w:r>
+              <w:t>            }</w:t>
+            </w:r>
+          </w:p>
+          <w:p>
+            <w:pPr>
+              <w:pStyle w:val="NormalWeb"/>
+            </w:pPr>
+            <w:r>
+              <w:t>        }</w:t>
+            </w:r>
+          </w:p>
+          <w:p>
+            <w:pPr>
+              <w:pStyle w:val="NormalWeb"/>
+            </w:pPr>
+          </w:p>
+          <w:p>
+            <w:pPr>
+              <w:pStyle w:val="NormalWeb"/>
+            </w:pPr>
+            <w:r>
+              <w:t>        function processImage(imageData) {</w:t>
+            </w:r>
+          </w:p>
+          <w:p>
+            <w:pPr>
+              <w:pStyle w:val="NormalWeb"/>
+            </w:pPr>
+            <w:r>
+              <w:t>            imagePreview.src = imageData;</w:t>
+            </w:r>
+          </w:p>
+          <w:p>
+            <w:pPr>
+              <w:pStyle w:val="NormalWeb"/>
+            </w:pPr>
+            <w:r>
+              <w:t>            imagePreview.style.display = 'block';</w:t>
+            </w:r>
+          </w:p>
+          <w:p>
+            <w:pPr>
+              <w:pStyle w:val="NormalWeb"/>
+            </w:pPr>
+            <w:r>
+              <w:t xml:space="preserve">            </w:t>
+            </w:r>
+          </w:p>
+          <w:p>
+            <w:pPr>
+              <w:pStyle w:val="NormalWeb"/>
+            </w:pPr>
+            <w:r>
+              <w:t>            if (cropper) {</w:t>
+            </w:r>
+          </w:p>
+          <w:p>
+            <w:pPr>
+              <w:pStyle w:val="NormalWeb"/>
+            </w:pPr>
+            <w:r>
+              <w:t>                cropper.destroy();</w:t>
+            </w:r>
+          </w:p>
+          <w:p>
+            <w:pPr>
+              <w:pStyle w:val="NormalWeb"/>
+            </w:pPr>
+            <w:r>
+              <w:t>            }</w:t>
+            </w:r>
+          </w:p>
+          <w:p>
+            <w:pPr>
+              <w:pStyle w:val="NormalWeb"/>
+            </w:pPr>
+            <w:r>
+              <w:t xml:space="preserve">            </w:t>
+            </w:r>
+          </w:p>
+          <w:p>
+            <w:pPr>
+              <w:pStyle w:val="NormalWeb"/>
+            </w:pPr>
+            <w:r>
+              <w:t>            cropper = new Cropper(imagePreview, {</w:t>
+            </w:r>
+          </w:p>
+          <w:p>
+            <w:pPr>
+              <w:pStyle w:val="NormalWeb"/>
+            </w:pPr>
+            <w:r>
+              <w:t>                aspectRatio: 1,</w:t>
+            </w:r>
+          </w:p>
+          <w:p>
+            <w:pPr>
+              <w:pStyle w:val="NormalWeb"/>
+            </w:pPr>
+            <w:r>
+              <w:t>                viewMode: 1,</w:t>
+            </w:r>
+          </w:p>
+          <w:p>
+            <w:pPr>
+              <w:pStyle w:val="NormalWeb"/>
+            </w:pPr>
+            <w:r>
+              <w:t>                crop: function(event) {</w:t>
+            </w:r>
+          </w:p>
+          <w:p>
+            <w:pPr>
+              <w:pStyle w:val="NormalWeb"/>
+            </w:pPr>
+            <w:r>
+              <w:t>                    const canvas = cropper.getCroppedCanvas();</w:t>
+            </w:r>
+          </w:p>
+          <w:p>
+            <w:pPr>
+              <w:pStyle w:val="NormalWeb"/>
+            </w:pPr>
+            <w:r>
+              <w:t>                    if (canvas) {</w:t>
+            </w:r>
+          </w:p>
+          <w:p>
+            <w:pPr>
+              <w:pStyle w:val="NormalWeb"/>
+            </w:pPr>
+            <w:r>
+              <w:t>                        detectQRCode(canvas);</w:t>
+            </w:r>
+          </w:p>
+          <w:p>
+            <w:pPr>
+              <w:pStyle w:val="NormalWeb"/>
+            </w:pPr>
+            <w:r>
+              <w:t>                    }</w:t>
+            </w:r>
+          </w:p>
+          <w:p>
+            <w:pPr>
+              <w:pStyle w:val="NormalWeb"/>
+            </w:pPr>
+            <w:r>
+              <w:t>                }</w:t>
+            </w:r>
+          </w:p>
+          <w:p>
+            <w:pPr>
+              <w:pStyle w:val="NormalWeb"/>
+            </w:pPr>
+            <w:r>
+              <w:t>            });</w:t>
+            </w:r>
+          </w:p>
+          <w:p>
+            <w:pPr>
+              <w:pStyle w:val="NormalWeb"/>
+            </w:pPr>
+            <w:r>
+              <w:t>        }</w:t>
+            </w:r>
+          </w:p>
+          <w:p>
+            <w:pPr>
+              <w:pStyle w:val="NormalWeb"/>
+            </w:pPr>
+          </w:p>
+          <w:p>
+            <w:pPr>
+              <w:pStyle w:val="NormalWeb"/>
+            </w:pPr>
+            <w:r>
+              <w:t>        async function detectQRCode(canvas) {</w:t>
+            </w:r>
+          </w:p>
+          <w:p>
+            <w:pPr>
+              <w:pStyle w:val="NormalWeb"/>
+            </w:pPr>
+            <w:r>
+              <w:t>            const imageData = canvas.getContext('2d').getImageData(0, 0, canvas.width, canvas.height);</w:t>
+            </w:r>
+          </w:p>
+          <w:p>
+            <w:pPr>
+              <w:pStyle w:val="NormalWeb"/>
+            </w:pPr>
+            <w:r>
+              <w:t>            const code = jsQR(imageData.data, imageData.width, imageData.height);</w:t>
+            </w:r>
+          </w:p>
+          <w:p>
+            <w:pPr>
+              <w:pStyle w:val="NormalWeb"/>
+            </w:pPr>
+            <w:r>
+              <w:t xml:space="preserve">            </w:t>
+            </w:r>
+          </w:p>
+          <w:p>
+            <w:pPr>
+              <w:pStyle w:val="NormalWeb"/>
+            </w:pPr>
+            <w:r>
+              <w:t>            if (code) {</w:t>
+            </w:r>
+          </w:p>
+          <w:p>
+            <w:pPr>
+              <w:pStyle w:val="NormalWeb"/>
+            </w:pPr>
+            <w:r>
+              <w:t>                const upiId = extractUPIFromURL(code.data);</w:t>
+            </w:r>
+          </w:p>
+          <w:p>
+            <w:pPr>
+              <w:pStyle w:val="NormalWeb"/>
+            </w:pPr>
+            <w:r>
+              <w:t>                if (upiId) {</w:t>
+            </w:r>
+          </w:p>
+          <w:p>
+            <w:pPr>
+              <w:pStyle w:val="NormalWeb"/>
+            </w:pPr>
+            <w:r>
+              <w:t>                    verifyUPIWithDatabase(upiId);</w:t>
+            </w:r>
+          </w:p>
+          <w:p>
+            <w:pPr>
+              <w:pStyle w:val="NormalWeb"/>
+            </w:pPr>
+            <w:r>
+              <w:t>                }</w:t>
+            </w:r>
+          </w:p>
+          <w:p>
+            <w:pPr>
+              <w:pStyle w:val="NormalWeb"/>
+            </w:pPr>
+            <w:r>
+              <w:t>            }</w:t>
+            </w:r>
+          </w:p>
+          <w:p>
+            <w:pPr>
+              <w:pStyle w:val="NormalWeb"/>
+            </w:pPr>
+            <w:r>
+              <w:t>        }</w:t>
+            </w:r>
+          </w:p>
+          <w:p>
+            <w:pPr>
+              <w:pStyle w:val="NormalWeb"/>
+            </w:pPr>
+          </w:p>
+          <w:p>
+            <w:pPr>
+              <w:pStyle w:val="NormalWeb"/>
+            </w:pPr>
+            <w:r>
+              <w:t>        function extractUPIFromURL(url) {</w:t>
+            </w:r>
+          </w:p>
+          <w:p>
+            <w:pPr>
+              <w:pStyle w:val="NormalWeb"/>
+            </w:pPr>
+            <w:r>
+              <w:t>            try {</w:t>
+            </w:r>
+          </w:p>
+          <w:p>
+            <w:pPr>
+              <w:pStyle w:val="NormalWeb"/>
+            </w:pPr>
+            <w:r>
+              <w:t>                const urlObj = new URL(url);</w:t>
+            </w:r>
+          </w:p>
+          <w:p>
+            <w:pPr>
+              <w:pStyle w:val="NormalWeb"/>
+            </w:pPr>
+            <w:r>
+              <w:t>                const pa = urlObj.searchParams.get('pa');</w:t>
+            </w:r>
+          </w:p>
+          <w:p>
+            <w:pPr>
+              <w:pStyle w:val="NormalWeb"/>
+            </w:pPr>
+            <w:r>
+              <w:t>                return pa ? pa.split('@')[0] : null;</w:t>
+            </w:r>
+          </w:p>
+          <w:p>
+            <w:pPr>
+              <w:pStyle w:val="NormalWeb"/>
+            </w:pPr>
+            <w:r>
+              <w:t>            } catch (e) {</w:t>
+            </w:r>
+          </w:p>
+          <w:p>
+            <w:pPr>
+              <w:pStyle w:val="NormalWeb"/>
+            </w:pPr>
+            <w:r>
+              <w:t>                return null;</w:t>
+            </w:r>
+          </w:p>
+          <w:p>
+            <w:pPr>
+              <w:pStyle w:val="NormalWeb"/>
+            </w:pPr>
+            <w:r>
+              <w:t>            }</w:t>
+            </w:r>
+          </w:p>
+          <w:p>
+            <w:pPr>
+              <w:pStyle w:val="NormalWeb"/>
+            </w:pPr>
+            <w:r>
+              <w:t>        }</w:t>
+            </w:r>
+          </w:p>
+          <w:p>
+            <w:pPr>
+              <w:pStyle w:val="NormalWeb"/>
+            </w:pPr>
+          </w:p>
+          <w:p>
+            <w:pPr>
+              <w:pStyle w:val="NormalWeb"/>
+            </w:pPr>
+            <w:r>
+              <w:t>        async function verifyUPIWithDatabase(upiId) {</w:t>
+            </w:r>
+          </w:p>
+          <w:p>
+            <w:pPr>
+              <w:pStyle w:val="NormalWeb"/>
+            </w:pPr>
+            <w:r>
+              <w:t>            try {</w:t>
+            </w:r>
+          </w:p>
+          <w:p>
+            <w:pPr>
+              <w:pStyle w:val="NormalWeb"/>
+            </w:pPr>
+            <w:r>
+              <w:t>                const response = await fetch('account_db.xml');</w:t>
+            </w:r>
+          </w:p>
+          <w:p>
+            <w:pPr>
+              <w:pStyle w:val="NormalWeb"/>
+            </w:pPr>
+            <w:r>
+              <w:t>                const xmlText = await response.text();</w:t>
+            </w:r>
+          </w:p>
+          <w:p>
+            <w:pPr>
+              <w:pStyle w:val="NormalWeb"/>
+            </w:pPr>
+            <w:r>
+              <w:t>                const parser = new DOMParser();</w:t>
+            </w:r>
+          </w:p>
+          <w:p>
+            <w:pPr>
+              <w:pStyle w:val="NormalWeb"/>
+            </w:pPr>
+            <w:r>
+              <w:t>                const xmlDoc = parser.parseFromString(xmlText, 'text/xml');</w:t>
+            </w:r>
+          </w:p>
+          <w:p>
+            <w:pPr>
+              <w:pStyle w:val="NormalWeb"/>
+            </w:pPr>
+            <w:r>
+              <w:t xml:space="preserve">                </w:t>
+            </w:r>
+          </w:p>
+          <w:p>
+            <w:pPr>
+              <w:pStyle w:val="NormalWeb"/>
+            </w:pPr>
+            <w:r>
+              <w:t>                const entities = xmlDoc.getElementsByTagName('Entity');</w:t>
+            </w:r>
+          </w:p>
+          <w:p>
+            <w:pPr>
+              <w:pStyle w:val="NormalWeb"/>
+            </w:pPr>
+            <w:r>
+              <w:t>                let found = false;</w:t>
+            </w:r>
+          </w:p>
+          <w:p>
+            <w:pPr>
+              <w:pStyle w:val="NormalWeb"/>
+            </w:pPr>
+            <w:r>
+              <w:t xml:space="preserve">                </w:t>
+            </w:r>
+          </w:p>
+          <w:p>
+            <w:pPr>
+              <w:pStyle w:val="NormalWeb"/>
+            </w:pPr>
+            <w:r>
+              <w:t>                for (let entity of entities) {</w:t>
+            </w:r>
+          </w:p>
+          <w:p>
+            <w:pPr>
+              <w:pStyle w:val="NormalWeb"/>
+            </w:pPr>
+            <w:r>
+              <w:t>                    const dbUpiId = entity.getElementsByTagName('upi_id')[0].textContent;</w:t>
+            </w:r>
+          </w:p>
+          <w:p>
+            <w:pPr>
+              <w:pStyle w:val="NormalWeb"/>
+            </w:pPr>
+            <w:r>
+              <w:t>                    if (dbUpiId === upiId) {</w:t>
+            </w:r>
+          </w:p>
+          <w:p>
+            <w:pPr>
+              <w:pStyle w:val="NormalWeb"/>
+            </w:pPr>
+            <w:r>
+              <w:t>                        const entityName = entity.getElementsByTagName('entity_name')[0].textContent;</w:t>
+            </w:r>
+          </w:p>
+          <w:p>
+            <w:pPr>
+              <w:pStyle w:val="NormalWeb"/>
+            </w:pPr>
+            <w:r>
+              <w:t>                        showResult(true, upiId, entityName);</w:t>
+            </w:r>
+          </w:p>
+          <w:p>
+            <w:pPr>
+              <w:pStyle w:val="NormalWeb"/>
+            </w:pPr>
+            <w:r>
+              <w:t>                        found = true;</w:t>
+            </w:r>
+          </w:p>
+          <w:p>
+            <w:pPr>
+              <w:pStyle w:val="NormalWeb"/>
+            </w:pPr>
+            <w:r>
+              <w:t>                        break;</w:t>
+            </w:r>
+          </w:p>
+          <w:p>
+            <w:pPr>
+              <w:pStyle w:val="NormalWeb"/>
+            </w:pPr>
+            <w:r>
+              <w:t>                    }</w:t>
+            </w:r>
+          </w:p>
+          <w:p>
+            <w:pPr>
+              <w:pStyle w:val="NormalWeb"/>
+            </w:pPr>
+            <w:r>
+              <w:t>                }</w:t>
+            </w:r>
+          </w:p>
+          <w:p>
+            <w:pPr>
+              <w:pStyle w:val="NormalWeb"/>
+            </w:pPr>
+            <w:r>
+              <w:t xml:space="preserve">                </w:t>
+            </w:r>
+          </w:p>
+          <w:p>
+            <w:pPr>
+              <w:pStyle w:val="NormalWeb"/>
+            </w:pPr>
+            <w:r>
+              <w:t>                if (!found) {</w:t>
+            </w:r>
+          </w:p>
+          <w:p>
+            <w:pPr>
+              <w:pStyle w:val="NormalWeb"/>
+            </w:pPr>
+            <w:r>
+              <w:t>                    showResult(false, upiId);</w:t>
+            </w:r>
+          </w:p>
+          <w:p>
+            <w:pPr>
+              <w:pStyle w:val="NormalWeb"/>
+            </w:pPr>
+            <w:r>
+              <w:t>                }</w:t>
+            </w:r>
+          </w:p>
+          <w:p>
+            <w:pPr>
+              <w:pStyle w:val="NormalWeb"/>
+            </w:pPr>
+            <w:r>
+              <w:t>            } catch (error) {</w:t>
+            </w:r>
+          </w:p>
+          <w:p>
+            <w:pPr>
+              <w:pStyle w:val="NormalWeb"/>
+            </w:pPr>
+            <w:r>
+              <w:t>                console.error('Error verifying UPI:', error);</w:t>
+            </w:r>
+          </w:p>
+          <w:p>
+            <w:pPr>
+              <w:pStyle w:val="NormalWeb"/>
+            </w:pPr>
+            <w:r>
+              <w:t>                resultDiv.innerHTML = 'Error verifying UPI ID. Please try again.';</w:t>
+            </w:r>
+          </w:p>
+          <w:p>
+            <w:pPr>
+              <w:pStyle w:val="NormalWeb"/>
+            </w:pPr>
+            <w:r>
+              <w:t>            }</w:t>
+            </w:r>
+          </w:p>
+          <w:p>
+            <w:pPr>
+              <w:pStyle w:val="NormalWeb"/>
+            </w:pPr>
+            <w:r>
+              <w:t>        }</w:t>
+            </w:r>
+          </w:p>
+          <w:p>
+            <w:pPr>
+              <w:pStyle w:val="NormalWeb"/>
+            </w:pPr>
+          </w:p>
+          <w:p>
+            <w:pPr>
+              <w:pStyle w:val="NormalWeb"/>
+            </w:pPr>
+            <w:r>
+              <w:t>        function showResult(isValid, upiId, entityName = '') {</w:t>
+            </w:r>
+          </w:p>
+          <w:p>
+            <w:pPr>
+              <w:pStyle w:val="NormalWeb"/>
+            </w:pPr>
+            <w:r>
+              <w:t>            if (isValid) {</w:t>
+            </w:r>
+          </w:p>
+          <w:p>
+            <w:pPr>
+              <w:pStyle w:val="NormalWeb"/>
+            </w:pPr>
+            <w:r>
+              <w:t>                resultDiv.innerHTML = `</w:t>
+            </w:r>
+          </w:p>
+          <w:p>
+            <w:pPr>
+              <w:pStyle w:val="NormalWeb"/>
+            </w:pPr>
+            <w:r>
+              <w:t>                    &lt;div class="valid-upi"&gt;</w:t>
+            </w:r>
+          </w:p>
+          <w:p>
+            <w:pPr>
+              <w:pStyle w:val="NormalWeb"/>
+            </w:pPr>
+            <w:r>
+              <w:t>                        &lt;p&gt;Verified UPI ID&lt;/p&gt;</w:t>
+            </w:r>
+          </w:p>
+          <w:p>
+            <w:pPr>
+              <w:pStyle w:val="NormalWeb"/>
+            </w:pPr>
+            <w:r>
+              <w:t>                        &lt;p&gt;${entityName}&lt;/p&gt;</w:t>
+            </w:r>
+          </w:p>
+          <w:p>
+            <w:pPr>
+              <w:pStyle w:val="NormalWeb"/>
+            </w:pPr>
+            <w:r>
+              <w:t>                        &lt;p&gt;${upiId}&lt;/p&gt;</w:t>
+            </w:r>
+          </w:p>
+          <w:p>
+            <w:pPr>
+              <w:pStyle w:val="NormalWeb"/>
+            </w:pPr>
+            <w:r>
+              <w:t>                        &lt;button class="copy-button" onclick="copyUPIId('${upiId}')"&gt;</w:t>
+            </w:r>
+          </w:p>
+          <w:p>
+            <w:pPr>
+              <w:pStyle w:val="NormalWeb"/>
+            </w:pPr>
+            <w:r>
+              <w:t>                            &lt;i class="fas fa-copy"&gt;&lt;/i&gt; Copy UPI ID</w:t>
+            </w:r>
+          </w:p>
+          <w:p>
+            <w:pPr>
+              <w:pStyle w:val="NormalWeb"/>
+            </w:pPr>
+            <w:r>
+              <w:t>                        &lt;/button&gt;</w:t>
+            </w:r>
+          </w:p>
+          <w:p>
+            <w:pPr>
+              <w:pStyle w:val="NormalWeb"/>
+            </w:pPr>
+            <w:r>
+              <w:t>                    &lt;/div&gt;</w:t>
+            </w:r>
+          </w:p>
+          <w:p>
+            <w:pPr>
+              <w:pStyle w:val="NormalWeb"/>
+            </w:pPr>
+            <w:r>
+              <w:t>                `;</w:t>
+            </w:r>
+          </w:p>
+          <w:p>
+            <w:pPr>
+              <w:pStyle w:val="NormalWeb"/>
+            </w:pPr>
+            <w:r>
+              <w:t>            } else {</w:t>
+            </w:r>
+          </w:p>
+          <w:p>
+            <w:pPr>
+              <w:pStyle w:val="NormalWeb"/>
+            </w:pPr>
+            <w:r>
+              <w:t>                resultDiv.innerHTML = `</w:t>
+            </w:r>
+          </w:p>
+          <w:p>
+            <w:pPr>
+              <w:pStyle w:val="NormalWeb"/>
+            </w:pPr>
+            <w:r>
+              <w:t>                    &lt;div class="invalid-upi"&gt;</w:t>
+            </w:r>
+          </w:p>
+          <w:p>
+            <w:pPr>
+              <w:pStyle w:val="NormalWeb"/>
+            </w:pPr>
+            <w:r>
+              <w:t>                        &lt;p&gt;Not a valid verified UPI ID&lt;/p&gt;</w:t>
+            </w:r>
+          </w:p>
+          <w:p>
+            <w:pPr>
+              <w:pStyle w:val="NormalWeb"/>
+            </w:pPr>
+            <w:r>
+              <w:t>                    &lt;/div&gt;</w:t>
+            </w:r>
+          </w:p>
+          <w:p>
+            <w:pPr>
+              <w:pStyle w:val="NormalWeb"/>
+            </w:pPr>
+            <w:r>
+              <w:t>                `;</w:t>
+            </w:r>
+          </w:p>
+          <w:p>
+            <w:pPr>
+              <w:pStyle w:val="NormalWeb"/>
+            </w:pPr>
+            <w:r>
+              <w:t>            }</w:t>
+            </w:r>
+          </w:p>
+          <w:p>
+            <w:pPr>
+              <w:pStyle w:val="NormalWeb"/>
+            </w:pPr>
+            <w:r>
+              <w:t>        }</w:t>
+            </w:r>
+          </w:p>
+          <w:p>
+            <w:pPr>
+              <w:pStyle w:val="NormalWeb"/>
+            </w:pPr>
+          </w:p>
+          <w:p>
+            <w:pPr>
+              <w:pStyle w:val="NormalWeb"/>
+            </w:pPr>
+            <w:r>
+              <w:t>        function copyUPIId(upiId) {</w:t>
+            </w:r>
+          </w:p>
+          <w:p>
+            <w:pPr>
+              <w:pStyle w:val="NormalWeb"/>
+            </w:pPr>
+            <w:r>
+              <w:t>            navigator.clipboard.writeText(upiId)</w:t>
+            </w:r>
+          </w:p>
+          <w:p>
+            <w:pPr>
+              <w:pStyle w:val="NormalWeb"/>
+            </w:pPr>
+            <w:r>
+              <w:t>                .then(() =&gt; alert('UPI ID copied to clipboard!'))</w:t>
+            </w:r>
+          </w:p>
+          <w:p>
+            <w:pPr>
+              <w:pStyle w:val="NormalWeb"/>
+            </w:pPr>
+            <w:r>
+              <w:t>                .catch(err =&gt; console.error('Error copying text:', err));</w:t>
+            </w:r>
+          </w:p>
+          <w:p>
+            <w:pPr>
+              <w:pStyle w:val="NormalWeb"/>
+            </w:pPr>
+            <w:r>
+              <w:t>        }</w:t>
+            </w:r>
+          </w:p>
+          <w:p>
+            <w:pPr>
+              <w:pStyle w:val="NormalWeb"/>
+            </w:pPr>
+            <w:r>
+              <w:t>    &lt;/script&gt;</w:t>
+            </w:r>
+          </w:p>
+          <w:p>
+            <w:pPr>
+              <w:pStyle w:val="NormalWeb"/>
+            </w:pPr>
+          </w:p>
+          <w:p>
+            <w:pPr>
+              <w:pStyle w:val="NormalWeb"/>
+            </w:pPr>
+            <w:r>
+              <w:t>&lt;script&gt;</w:t>
+            </w:r>
+          </w:p>
+          <w:p>
+            <w:pPr>
+              <w:pStyle w:val="NormalWeb"/>
+            </w:pPr>
+            <w:r>
+              <w:t>    document.addEventListener('DOMContentLoaded', function() {</w:t>
+            </w:r>
+          </w:p>
+          <w:p>
+            <w:pPr>
+              <w:pStyle w:val="NormalWeb"/>
+            </w:pPr>
+            <w:r>
+              <w:t>        updateLanguageDisplay();</w:t>
+            </w:r>
+          </w:p>
+          <w:p>
+            <w:pPr>
+              <w:pStyle w:val="NormalWeb"/>
+            </w:pPr>
+            <w:r>
+              <w:t>    });</w:t>
+            </w:r>
+          </w:p>
+          <w:p>
+            <w:pPr>
+              <w:pStyle w:val="NormalWeb"/>
+            </w:pPr>
+          </w:p>
+          <w:p>
+            <w:pPr>
+              <w:pStyle w:val="NormalWeb"/>
+            </w:pPr>
+            <w:r>
+              <w:t>    function updateLanguageDisplay() {</w:t>
+            </w:r>
+          </w:p>
+          <w:p>
+            <w:pPr>
+              <w:pStyle w:val="NormalWeb"/>
+            </w:pPr>
+            <w:r>
+              <w:t>        const preferredLanguage = localStorage.getItem('preferredLanguage');</w:t>
+            </w:r>
+          </w:p>
+          <w:p>
+            <w:pPr>
+              <w:pStyle w:val="NormalWeb"/>
+            </w:pPr>
+          </w:p>
+          <w:p>
+            <w:pPr>
+              <w:pStyle w:val="NormalWeb"/>
+            </w:pPr>
+            <w:r>
+              <w:t>        fetch('check_list.xml') // Ensure this file exists and is accessible</w:t>
+            </w:r>
+          </w:p>
+          <w:p>
+            <w:pPr>
+              <w:pStyle w:val="NormalWeb"/>
+            </w:pPr>
+            <w:r>
+              <w:t>            .then(response =&gt; {</w:t>
+            </w:r>
+          </w:p>
+          <w:p>
+            <w:pPr>
+              <w:pStyle w:val="NormalWeb"/>
+            </w:pPr>
+            <w:r>
+              <w:t>                if (!response.ok) {</w:t>
+            </w:r>
+          </w:p>
+          <w:p>
+            <w:pPr>
+              <w:pStyle w:val="NormalWeb"/>
+            </w:pPr>
+            <w:r>
+              <w:t>                    throw new Error(`HTTP error! status: ${response.status}`);</w:t>
+            </w:r>
+          </w:p>
+          <w:p>
+            <w:pPr>
+              <w:pStyle w:val="NormalWeb"/>
+            </w:pPr>
+            <w:r>
+              <w:t>                }</w:t>
+            </w:r>
+          </w:p>
+          <w:p>
+            <w:pPr>
+              <w:pStyle w:val="NormalWeb"/>
+            </w:pPr>
+            <w:r>
+              <w:t>                return response.text();</w:t>
+            </w:r>
+          </w:p>
+          <w:p>
+            <w:pPr>
+              <w:pStyle w:val="NormalWeb"/>
+            </w:pPr>
+            <w:r>
+              <w:t>             })</w:t>
+            </w:r>
+          </w:p>
+          <w:p>
+            <w:pPr>
+              <w:pStyle w:val="NormalWeb"/>
+            </w:pPr>
+            <w:r>
+              <w:t>            .then(data =&gt; {</w:t>
+            </w:r>
+          </w:p>
+          <w:p>
+            <w:pPr>
+              <w:pStyle w:val="NormalWeb"/>
+            </w:pPr>
+            <w:r>
+              <w:t>                const parser = new DOMParser();</w:t>
+            </w:r>
+          </w:p>
+          <w:p>
+            <w:pPr>
+              <w:pStyle w:val="NormalWeb"/>
+            </w:pPr>
+            <w:r>
+              <w:t>                const xmlDoc = parser.parseFromString(data, "text/xml");</w:t>
+            </w:r>
+          </w:p>
+          <w:p>
+            <w:pPr>
+              <w:pStyle w:val="NormalWeb"/>
+            </w:pPr>
+            <w:r>
+              <w:t>                 const parserError = xmlDoc.querySelector("parsererror");</w:t>
+            </w:r>
+          </w:p>
+          <w:p>
+            <w:pPr>
+              <w:pStyle w:val="NormalWeb"/>
+            </w:pPr>
+            <w:r>
+              <w:t>                 if (parserError) {</w:t>
+            </w:r>
+          </w:p>
+          <w:p>
+            <w:pPr>
+              <w:pStyle w:val="NormalWeb"/>
+            </w:pPr>
+            <w:r>
+              <w:t>                     console.error('Error parsing XML:', parserError);</w:t>
+            </w:r>
+          </w:p>
+          <w:p>
+            <w:pPr>
+              <w:pStyle w:val="NormalWeb"/>
+            </w:pPr>
+            <w:r>
+              <w:t>                     throw new Error('Failed to parse language XML.');</w:t>
+            </w:r>
+          </w:p>
+          <w:p>
+            <w:pPr>
+              <w:pStyle w:val="NormalWeb"/>
+            </w:pPr>
+            <w:r>
+              <w:t>                 }</w:t>
+            </w:r>
+          </w:p>
+          <w:p>
+            <w:pPr>
+              <w:pStyle w:val="NormalWeb"/>
+            </w:pPr>
+          </w:p>
+          <w:p>
+            <w:pPr>
+              <w:pStyle w:val="NormalWeb"/>
+            </w:pPr>
+            <w:r>
+              <w:t>                const languages = xmlDoc.getElementsByTagName("language");</w:t>
+            </w:r>
+          </w:p>
+          <w:p>
+            <w:pPr>
+              <w:pStyle w:val="NormalWeb"/>
+            </w:pPr>
+            <w:r>
+              <w:t>                let found = false;</w:t>
+            </w:r>
+          </w:p>
+          <w:p>
+            <w:pPr>
+              <w:pStyle w:val="NormalWeb"/>
+            </w:pPr>
+            <w:r>
+              <w:t>                for (let i = 0; i &lt; languages.length; i++) {</w:t>
+            </w:r>
+          </w:p>
+          <w:p>
+            <w:pPr>
+              <w:pStyle w:val="NormalWeb"/>
+            </w:pPr>
+            <w:r>
+              <w:t>                    const langId = languages[i].getAttribute('id');</w:t>
+            </w:r>
+          </w:p>
+          <w:p>
+            <w:pPr>
+              <w:pStyle w:val="NormalWeb"/>
+            </w:pPr>
+            <w:r>
+              <w:t>                    if (langId === preferredLanguage) {</w:t>
+            </w:r>
+          </w:p>
+          <w:p>
+            <w:pPr>
+              <w:pStyle w:val="NormalWeb"/>
+            </w:pPr>
+            <w:r>
+              <w:t>                        document.getElementById('current-language').textContent = languages[i].textContent;</w:t>
+            </w:r>
+          </w:p>
+          <w:p>
+            <w:pPr>
+              <w:pStyle w:val="NormalWeb"/>
+            </w:pPr>
+            <w:r>
+              <w:t>                        found = true;</w:t>
+            </w:r>
+          </w:p>
+          <w:p>
+            <w:pPr>
+              <w:pStyle w:val="NormalWeb"/>
+            </w:pPr>
+            <w:r>
+              <w:t>                        break;</w:t>
+            </w:r>
+          </w:p>
+          <w:p>
+            <w:pPr>
+              <w:pStyle w:val="NormalWeb"/>
+            </w:pPr>
+            <w:r>
+              <w:t>                    }</w:t>
+            </w:r>
+          </w:p>
+          <w:p>
+            <w:pPr>
+              <w:pStyle w:val="NormalWeb"/>
+            </w:pPr>
+            <w:r>
+              <w:t>                }</w:t>
+            </w:r>
+          </w:p>
+          <w:p>
+            <w:pPr>
+              <w:pStyle w:val="NormalWeb"/>
+            </w:pPr>
+            <w:r>
+              <w:t>                if (!found) {</w:t>
+            </w:r>
+          </w:p>
+          <w:p>
+            <w:pPr>
+              <w:pStyle w:val="NormalWeb"/>
+            </w:pPr>
+            <w:r>
+              <w:t>                     const defaultLangElement = xmlDoc.querySelector("language[id='en']") || languages[0];</w:t>
+            </w:r>
+          </w:p>
+          <w:p>
+            <w:pPr>
+              <w:pStyle w:val="NormalWeb"/>
+            </w:pPr>
+            <w:r>
+              <w:t>                     document.getElementById('current-language').textContent = defaultLangElement ? defaultLangElement.textContent : 'English';</w:t>
+            </w:r>
+          </w:p>
+          <w:p>
+            <w:pPr>
+              <w:pStyle w:val="NormalWeb"/>
+            </w:pPr>
+            <w:r>
+              <w:t>                }</w:t>
+            </w:r>
+          </w:p>
+          <w:p>
+            <w:pPr>
+              <w:pStyle w:val="NormalWeb"/>
+            </w:pPr>
+          </w:p>
+          <w:p>
+            <w:pPr>
+              <w:pStyle w:val="NormalWeb"/>
+            </w:pPr>
+            <w:r>
+              <w:t>            })</w:t>
+            </w:r>
+          </w:p>
+          <w:p>
+            <w:pPr>
+              <w:pStyle w:val="NormalWeb"/>
+            </w:pPr>
+            <w:r>
+              <w:t>            .catch(error =&gt; {</w:t>
+            </w:r>
+          </w:p>
+          <w:p>
+            <w:pPr>
+              <w:pStyle w:val="NormalWeb"/>
+            </w:pPr>
+            <w:r>
+              <w:t>                console.error('Error loading or parsing language list:', error);</w:t>
+            </w:r>
+          </w:p>
+          <w:p>
+            <w:pPr>
+              <w:pStyle w:val="NormalWeb"/>
+            </w:pPr>
+            <w:r>
+              <w:t>                document.getElementById('current-language').textContent = preferredLanguage ? getLangNameFromCode(preferredLanguage) : 'English'; // Use a helper if needed</w:t>
+            </w:r>
+          </w:p>
+          <w:p>
+            <w:pPr>
+              <w:pStyle w:val="NormalWeb"/>
+            </w:pPr>
+            <w:r>
+              <w:t>            });</w:t>
+            </w:r>
+          </w:p>
+          <w:p>
+            <w:pPr>
+              <w:pStyle w:val="NormalWeb"/>
+            </w:pPr>
+            <w:r>
+              <w:t>    }</w:t>
+            </w:r>
+          </w:p>
+          <w:p>
+            <w:pPr>
+              <w:pStyle w:val="NormalWeb"/>
+            </w:pPr>
+          </w:p>
+          <w:p>
+            <w:pPr>
+              <w:pStyle w:val="NormalWeb"/>
+            </w:pPr>
+            <w:r>
+              <w:t>    // Optional helper function</w:t>
+            </w:r>
+          </w:p>
+          <w:p>
+            <w:pPr>
+              <w:pStyle w:val="NormalWeb"/>
+            </w:pPr>
+            <w:r>
+              <w:t>    function getLangNameFromCode(langCode) {</w:t>
+            </w:r>
+          </w:p>
+          <w:p>
+            <w:pPr>
+              <w:pStyle w:val="NormalWeb"/>
+            </w:pPr>
+            <w:r>
+              <w:t>        const names = { 'en': 'English', 'hi': '</w:t>
+            </w:r>
+            <w:r>
+              <w:rPr>
+                <w:rFonts w:cs="Mangal"/>
+                <w:cs/>
+              </w:rPr>
+              <w:t>हिन्दी</w:t>
+            </w:r>
+            <w:r>
+              <w:t>' }; // Add more known languages</w:t>
+            </w:r>
+          </w:p>
+          <w:p>
+            <w:pPr>
+              <w:pStyle w:val="NormalWeb"/>
+            </w:pPr>
+            <w:r>
+              <w:t>        return names[langCode] || langCode || 'English'; // Fallback logic</w:t>
+            </w:r>
+          </w:p>
+          <w:p>
+            <w:pPr>
+              <w:pStyle w:val="NormalWeb"/>
+            </w:pPr>
+            <w:r>
+              <w:t>    }</w:t>
+            </w:r>
+          </w:p>
+          <w:p>
+            <w:pPr>
+              <w:pStyle w:val="NormalWeb"/>
+            </w:pPr>
+          </w:p>
+          <w:p>
+            <w:pPr>
+              <w:pStyle w:val="NormalWeb"/>
+            </w:pPr>
+          </w:p>
+          <w:p>
+            <w:pPr>
+              <w:pStyle w:val="NormalWeb"/>
+            </w:pPr>
+            <w:r>
+              <w:t>    function changeLanguage() {</w:t>
+            </w:r>
+          </w:p>
+          <w:p>
+            <w:pPr>
+              <w:pStyle w:val="NormalWeb"/>
+            </w:pPr>
+            <w:r>
+              <w:t>        // Redirect to language selection page</w:t>
+            </w:r>
+          </w:p>
+          <w:p>
+            <w:pPr>
+              <w:pStyle w:val="NormalWeb"/>
+            </w:pPr>
+            <w:r>
+              <w:t>        window.location.href = 'lang_select.html'; // Ensure this page exists</w:t>
+            </w:r>
+          </w:p>
+          <w:p>
+            <w:pPr>
+              <w:pStyle w:val="NormalWeb"/>
+            </w:pPr>
+            <w:r>
+              <w:t>    }</w:t>
+            </w:r>
+          </w:p>
+          <w:p>
+            <w:pPr>
+              <w:pStyle w:val="NormalWeb"/>
+            </w:pPr>
+            <w:r>
+              <w:t>&lt;/script&gt;</w:t>
+            </w:r>
+          </w:p>
+          <w:p>
+            <w:pPr>
+              <w:pStyle w:val="NormalWeb"/>
+            </w:pPr>
+            <w:r>
+              <w:t>&lt;/body&gt;</w:t>
+            </w:r>
+          </w:p>
+          <w:p>
+            <w:pPr>
+              <w:pStyle w:val="NormalWeb"/>
+            </w:pPr>
+            <w:r>
+              <w:t>&lt;/html&gt;</w:t>
+            </w:r>
+          </w:p>
+          <w:p>
+            <w:pPr>
+              <w:pStyle w:val="NormalWeb"/>
+            </w:pPr>
+          </w:p>
+          <w:p>
+            <w:pPr>
+              <w:pStyle w:val="NormalWeb"/>
+            </w:pPr>
+          </w:p>
+          <w:p>
+            <w:pPr>
+              <w:pStyle w:val="NormalWeb"/>
+            </w:pPr>
+            <w:r>
+              <w:t>-------</w:t>
+            </w:r>
+          </w:p>
+          <w:p>
+            <w:pPr>
+              <w:pStyle w:val="NormalWeb"/>
+            </w:pPr>
+            <w:r>
+              <w:t>account_db.xml</w:t>
+            </w:r>
+          </w:p>
+          <w:p>
+            <w:pPr>
+              <w:pStyle w:val="NormalWeb"/>
+            </w:pPr>
+            <w:r>
+              <w:t>-------</w:t>
+            </w:r>
+          </w:p>
+          <w:p>
+            <w:pPr>
+              <w:pStyle w:val="NormalWeb"/>
+            </w:pPr>
+            <w:r>
+              <w:t>&lt;?xml version="1.0" encoding="UTF-8" standalone="yes"?&gt;</w:t>
+            </w:r>
+          </w:p>
+          <w:p>
+            <w:pPr>
+              <w:pStyle w:val="NormalWeb"/>
+            </w:pPr>
+            <w:r>
+              <w:t>&lt;Entities xmlns:xsi="http://www.w3.org/2001/XMLSchema-instance"&gt;</w:t>
+            </w:r>
+          </w:p>
+          <w:p>
+            <w:pPr>
+              <w:pStyle w:val="NormalWeb"/>
+            </w:pPr>
+            <w:r>
+              <w:t>    &lt;Entity&gt;</w:t>
+            </w:r>
+          </w:p>
+          <w:p>
+            <w:pPr>
+              <w:pStyle w:val="NormalWeb"/>
+            </w:pPr>
+            <w:r>
+              <w:t>        &lt;SR&gt;1&lt;/SR&gt;</w:t>
+            </w:r>
+          </w:p>
+          <w:p>
+            <w:pPr>
+              <w:pStyle w:val="NormalWeb"/>
+            </w:pPr>
+            <w:r>
+              <w:t>        &lt;ifsc&gt;C0028&lt;/ifsc&gt;</w:t>
+            </w:r>
+          </w:p>
+          <w:p>
+            <w:pPr>
+              <w:pStyle w:val="NormalWeb"/>
+            </w:pPr>
+            <w:r>
+              <w:t>        &lt;account_no&gt;brk&lt;/account_no&gt;</w:t>
+            </w:r>
+          </w:p>
+          <w:p>
+            <w:pPr>
+              <w:pStyle w:val="NormalWeb"/>
+            </w:pPr>
+            <w:r>
+              <w:t>        &lt;registration_no&gt;INZ000010231&lt;/registration_no&gt;</w:t>
+            </w:r>
+          </w:p>
+          <w:p>
+            <w:pPr>
+              <w:pStyle w:val="NormalWeb"/>
+            </w:pPr>
+            <w:r>
+              <w:t>        &lt;entity_name&gt;5PAISA CAPITAL LIMITED&lt;/entity_name&gt;</w:t>
+            </w:r>
+          </w:p>
+          <w:p>
+            <w:pPr>
+              <w:pStyle w:val="NormalWeb"/>
+            </w:pPr>
+            <w:r>
+              <w:t>        &lt;upi_id&gt;5paisacapital.brk@validhdfc&lt;/upi_id&gt;</w:t>
+            </w:r>
+          </w:p>
+          <w:p>
+            <w:pPr>
+              <w:pStyle w:val="NormalWeb"/>
+            </w:pPr>
+            <w:r>
+              <w:t>    &lt;/Entity&gt;</w:t>
+            </w:r>
+          </w:p>
+          <w:p>
+            <w:pPr>
+              <w:pStyle w:val="NormalWeb"/>
+            </w:pPr>
+            <w:r>
+              <w:t>    &lt;Entity&gt;</w:t>
+            </w:r>
+          </w:p>
+          <w:p>
+            <w:pPr>
+              <w:pStyle w:val="NormalWeb"/>
+            </w:pPr>
+            <w:r>
+              <w:t>        &lt;SR&gt;2&lt;/SR&gt;</w:t>
+            </w:r>
+          </w:p>
+          <w:p>
+            <w:pPr>
+              <w:pStyle w:val="NormalWeb"/>
+            </w:pPr>
+            <w:r>
+              <w:t>        &lt;ifsc&gt;C0557&lt;/ifsc&gt;</w:t>
+            </w:r>
+          </w:p>
+          <w:p>
+            <w:pPr>
+              <w:pStyle w:val="NormalWeb"/>
+            </w:pPr>
+            <w:r>
+              <w:t>        &lt;account_no&gt;brk&lt;/account_no&gt;</w:t>
+            </w:r>
+          </w:p>
+          <w:p>
+            <w:pPr>
+              <w:pStyle w:val="NormalWeb"/>
+            </w:pPr>
+            <w:r>
+              <w:t>        &lt;registration_no&gt;INB011326437&lt;/registration_no&gt;</w:t>
+            </w:r>
+          </w:p>
+          <w:p>
+            <w:pPr>
+              <w:pStyle w:val="NormalWeb"/>
+            </w:pPr>
+            <w:r>
+              <w:t>        &lt;entity_name&gt;A C AGARWAL SHARE BROKERS PRIVATE LIMITED&lt;/entity_name&gt;</w:t>
+            </w:r>
+          </w:p>
+          <w:p>
+            <w:pPr>
+              <w:pStyle w:val="NormalWeb"/>
+            </w:pPr>
+            <w:r>
+              <w:t>        &lt;upi_id&gt;acagarwal.brk@validhdfc&lt;/upi_id&gt;</w:t>
+            </w:r>
+          </w:p>
+          <w:p>
+            <w:pPr>
+              <w:pStyle w:val="NormalWeb"/>
+            </w:pPr>
+            <w:r>
+              <w:t>    &lt;/Entity&gt;</w:t>
+            </w:r>
+          </w:p>
+          <w:p>
+            <w:pPr>
+              <w:pStyle w:val="NormalWeb"/>
+            </w:pPr>
+            <w:r>
+              <w:t>&lt;/Entities&gt;</w:t>
+            </w:r>
+          </w:p>
+          <w:p/>
+        </w:tc>
+      </w:tr>
+    </w:tbl>
+    <w:p/>
     <w:sectPr>
       <w:pgSz w:w="11906" w:h="16838"/>
       <w:pgMar w:top="1440" w:right="1440" w:bottom="1440" w:left="1440" w:header="708" w:footer="708" w:gutter="0"/>
@@ -1280,6 +5517,41 @@
       <w:spacing w:val="5"/>
     </w:rPr>
   </w:style>
+  <w:style w:type="table" w:styleId="TableGrid">
+    <w:name w:val="Table Grid"/>
+    <w:basedOn w:val="TableNormal"/>
+    <w:uiPriority w:val="39"/>
+    <w:rsid w:val="001A6F1E"/>
+    <w:pPr>
+      <w:spacing w:after="0" w:line="240" w:lineRule="auto"/>
+    </w:pPr>
+    <w:tblPr>
+      <w:tblBorders>
+        <w:top w:val="single" w:sz="4" w:space="0" w:color="auto"/>
+        <w:left w:val="single" w:sz="4" w:space="0" w:color="auto"/>
+        <w:bottom w:val="single" w:sz="4" w:space="0" w:color="auto"/>
+        <w:right w:val="single" w:sz="4" w:space="0" w:color="auto"/>
+        <w:insideH w:val="single" w:sz="4" w:space="0" w:color="auto"/>
+        <w:insideV w:val="single" w:sz="4" w:space="0" w:color="auto"/>
+      </w:tblBorders>
+    </w:tblPr>
+  </w:style>
+  <w:style w:type="paragraph" w:styleId="NormalWeb">
+    <w:name w:val="Normal (Web)"/>
+    <w:basedOn w:val="Normal"/>
+    <w:uiPriority w:val="99"/>
+    <w:semiHidden/>
+    <w:unhideWhenUsed/>
+    <w:rsid w:val="001A6F1E"/>
+    <w:pPr>
+      <w:spacing w:before="100" w:beforeAutospacing="1" w:after="100" w:afterAutospacing="1" w:line="240" w:lineRule="auto"/>
+    </w:pPr>
+    <w:rPr>
+      <w:rFonts w:ascii="Times New Roman" w:eastAsia="Times New Roman" w:hAnsi="Times New Roman"/>
+      <w:szCs w:val="24"/>
+      <w:lang w:eastAsia="en-IN"/>
+    </w:rPr>
+  </w:style>
 </w:styles>
 </file>
 

</xml_diff>